<commit_message>
Ajout de nouvelles animations et ajustements de style pour les cartes flottantes, mise à jour du CV et modification des technologies dans le portfolio.
</commit_message>
<xml_diff>
--- a/assets/docs/cv cad.docx
+++ b/assets/docs/cv cad.docx
@@ -293,7 +293,7 @@
                 <w:szCs w:val="28"/>
                 <w:lang w:bidi="fr-FR"/>
               </w:rPr>
-              <w:t xml:space="preserve">                                                                                                                                                                                 </w:t>
+              <w:t xml:space="preserve">                                                                                                                                            </w:t>
             </w:r>
           </w:p>
         </w:tc>
@@ -507,8 +507,6 @@
             <w:pPr>
               <w:rPr>
                 <w:rStyle w:val="Lienhypertexte"/>
-                <w:color w:val="auto"/>
-                <w:u w:val="none"/>
                 <w:lang w:bidi="fr-FR"/>
               </w:rPr>
             </w:pPr>
@@ -526,11 +524,56 @@
             <w:pPr>
               <w:rPr>
                 <w:rStyle w:val="Lienhypertexte"/>
+                <w:lang w:bidi="fr-FR"/>
+              </w:rPr>
+            </w:pPr>
+          </w:p>
+          <w:p>
+            <w:pPr>
+              <w:rPr>
+                <w:rStyle w:val="Lienhypertexte"/>
+                <w:b/>
+                <w:bCs/>
                 <w:color w:val="auto"/>
                 <w:u w:val="none"/>
                 <w:lang w:bidi="fr-FR"/>
               </w:rPr>
             </w:pPr>
+            <w:r>
+              <w:rPr>
+                <w:b/>
+                <w:bCs/>
+                <w:lang w:bidi="fr-FR"/>
+              </w:rPr>
+              <w:t>Portfolio</w:t>
+            </w:r>
+            <w:r>
+              <w:rPr>
+                <w:b/>
+                <w:bCs/>
+                <w:lang w:bidi="fr-FR"/>
+              </w:rPr>
+              <w:t> :</w:t>
+            </w:r>
+          </w:p>
+          <w:p>
+            <w:pPr>
+              <w:rPr>
+                <w:rStyle w:val="Lienhypertexte"/>
+                <w:color w:val="auto"/>
+                <w:u w:val="none"/>
+                <w:lang w:bidi="fr-FR"/>
+              </w:rPr>
+            </w:pPr>
+            <w:r>
+              <w:rPr>
+                <w:rStyle w:val="Lienhypertexte"/>
+                <w:color w:val="auto"/>
+                <w:u w:val="none"/>
+                <w:lang w:bidi="fr-FR"/>
+              </w:rPr>
+              <w:t>https://mehdi-ikrar.github.io/portfolio/</w:t>
+            </w:r>
           </w:p>
           <w:p>
             <w:pPr>
@@ -572,20 +615,31 @@
             </w:r>
           </w:p>
           <w:p>
-            <w:r>
-              <w:t>Développent</w:t>
-            </w:r>
-          </w:p>
-          <w:p>
+            <w:proofErr w:type="spellStart"/>
             <w:proofErr w:type="gramStart"/>
             <w:r>
-              <w:rPr>
-                <w:lang w:bidi="fr-FR"/>
-              </w:rPr>
-              <w:t>Sport:</w:t>
+              <w:t>Dév</w:t>
+            </w:r>
+            <w:proofErr w:type="spellEnd"/>
+            <w:r>
+              <w:t xml:space="preserve"> ,</w:t>
             </w:r>
             <w:proofErr w:type="gramEnd"/>
             <w:r>
+              <w:t xml:space="preserve"> IT , technologie du n</w:t>
+            </w:r>
+            <w:r>
+              <w:t>umérique</w:t>
+            </w:r>
+          </w:p>
+          <w:p>
+            <w:r>
+              <w:rPr>
+                <w:lang w:bidi="fr-FR"/>
+              </w:rPr>
+              <w:t>Sport :</w:t>
+            </w:r>
+            <w:r>
               <w:rPr>
                 <w:lang w:bidi="fr-FR"/>
               </w:rPr>
@@ -616,7 +670,19 @@
               <w:rPr>
                 <w:lang w:bidi="fr-FR"/>
               </w:rPr>
-              <w:t xml:space="preserve">ratique régulière de musculation et cardio </w:t>
+              <w:t xml:space="preserve">ratique régulière </w:t>
+            </w:r>
+            <w:r>
+              <w:rPr>
+                <w:lang w:bidi="fr-FR"/>
+              </w:rPr>
+              <w:t>de sport</w:t>
+            </w:r>
+            <w:r>
+              <w:rPr>
+                <w:lang w:bidi="fr-FR"/>
+              </w:rPr>
+              <w:t xml:space="preserve"> </w:t>
             </w:r>
           </w:p>
           <w:p>
@@ -685,14 +751,12 @@
               </w:rPr>
               <w:t xml:space="preserve">FRANÇAIS : </w:t>
             </w:r>
-            <w:proofErr w:type="gramStart"/>
-            <w:r>
-              <w:rPr>
-                <w:lang w:bidi="fr-FR"/>
-              </w:rPr>
-              <w:t>langue maternels</w:t>
-            </w:r>
-            <w:proofErr w:type="gramEnd"/>
+            <w:r>
+              <w:rPr>
+                <w:lang w:bidi="fr-FR"/>
+              </w:rPr>
+              <w:t>langue maternelle</w:t>
+            </w:r>
           </w:p>
           <w:p>
             <w:pPr>
@@ -730,6 +794,9 @@
         <w:tc>
           <w:tcPr>
             <w:tcW w:w="6660" w:type="dxa"/>
+            <w:tcBorders>
+              <w:bottom w:val="single" w:sz="4" w:space="0" w:color="auto"/>
+            </w:tcBorders>
           </w:tcPr>
           <w:sdt>
             <w:sdtPr>
@@ -756,15 +823,6 @@
             </w:sdtContent>
           </w:sdt>
           <w:p>
-            <w:pPr>
-              <w:pStyle w:val="Titre4"/>
-              <w:rPr>
-                <w:bCs/>
-                <w:lang w:bidi="fr-FR"/>
-              </w:rPr>
-            </w:pPr>
-          </w:p>
-          <w:p>
             <w:r>
               <w:rPr>
                 <w:b/>
@@ -854,11 +912,15 @@
                 <w:numId w:val="6"/>
               </w:numPr>
               <w:rPr>
+                <w:b w:val="0"/>
+                <w:bCs/>
                 <w:lang w:bidi="fr-FR"/>
               </w:rPr>
             </w:pPr>
             <w:r>
               <w:rPr>
+                <w:b w:val="0"/>
+                <w:bCs/>
                 <w:lang w:bidi="fr-FR"/>
               </w:rPr>
               <w:t>TNT Express France, Aulnay-sous-Bois (2020-2021)</w:t>
@@ -872,11 +934,15 @@
                 <w:numId w:val="7"/>
               </w:numPr>
               <w:rPr>
+                <w:b w:val="0"/>
+                <w:bCs/>
                 <w:lang w:bidi="fr-FR"/>
               </w:rPr>
             </w:pPr>
             <w:r>
               <w:rPr>
+                <w:b w:val="0"/>
+                <w:bCs/>
                 <w:lang w:bidi="fr-FR"/>
               </w:rPr>
               <w:t>Monoprix (2019) : Préparation et emballage des commandes en ligne</w:t>
@@ -912,21 +978,16 @@
                 <w:numId w:val="5"/>
               </w:numPr>
               <w:rPr>
+                <w:b w:val="0"/>
                 <w:lang w:bidi="fr-FR"/>
               </w:rPr>
             </w:pPr>
             <w:r>
               <w:rPr>
-                <w:bCs/>
-                <w:lang w:bidi="fr-FR"/>
-              </w:rPr>
-              <w:t>APIS (2016-2018)</w:t>
-            </w:r>
-            <w:r>
-              <w:rPr>
-                <w:lang w:bidi="fr-FR"/>
-              </w:rPr>
-              <w:t xml:space="preserve"> : Sureté du parc lors des expositions</w:t>
+                <w:b w:val="0"/>
+                <w:lang w:bidi="fr-FR"/>
+              </w:rPr>
+              <w:t>APIS (2016-2018) : Sureté du parc lors des expositions</w:t>
             </w:r>
           </w:p>
           <w:p>
@@ -937,13 +998,14 @@
                 <w:numId w:val="5"/>
               </w:numPr>
               <w:rPr>
+                <w:b w:val="0"/>
                 <w:lang w:bidi="fr-FR"/>
               </w:rPr>
             </w:pPr>
             <w:proofErr w:type="spellStart"/>
             <w:r>
               <w:rPr>
-                <w:bCs/>
+                <w:b w:val="0"/>
                 <w:lang w:bidi="fr-FR"/>
               </w:rPr>
               <w:t>Sngst</w:t>
@@ -951,16 +1013,10 @@
             <w:proofErr w:type="spellEnd"/>
             <w:r>
               <w:rPr>
-                <w:bCs/>
-                <w:lang w:bidi="fr-FR"/>
-              </w:rPr>
-              <w:t xml:space="preserve"> (2014-2015)</w:t>
-            </w:r>
-            <w:r>
-              <w:rPr>
-                <w:lang w:bidi="fr-FR"/>
-              </w:rPr>
-              <w:t xml:space="preserve"> : Surveillance de sites mairie de Paris</w:t>
+                <w:b w:val="0"/>
+                <w:lang w:bidi="fr-FR"/>
+              </w:rPr>
+              <w:t xml:space="preserve"> (2014-2015) : Surveillance de sites mairie de Paris</w:t>
             </w:r>
           </w:p>
           <w:p>
@@ -971,21 +1027,16 @@
                 <w:numId w:val="5"/>
               </w:numPr>
               <w:rPr>
+                <w:b w:val="0"/>
                 <w:lang w:bidi="fr-FR"/>
               </w:rPr>
             </w:pPr>
             <w:r>
               <w:rPr>
-                <w:bCs/>
-                <w:lang w:bidi="fr-FR"/>
-              </w:rPr>
-              <w:t>GSP (2013-2014)</w:t>
-            </w:r>
-            <w:r>
-              <w:rPr>
-                <w:lang w:bidi="fr-FR"/>
-              </w:rPr>
-              <w:t xml:space="preserve"> : Surveillance du public au Grand Palais (Paris)</w:t>
+                <w:b w:val="0"/>
+                <w:lang w:bidi="fr-FR"/>
+              </w:rPr>
+              <w:t>GSP (2013-2014) : Surveillance du public au Grand Palais (Paris)</w:t>
             </w:r>
           </w:p>
           <w:sdt>
@@ -1244,16 +1295,19 @@
           <w:p>
             <w:pPr>
               <w:pStyle w:val="Titre2"/>
+              <w:rPr>
+                <w:lang w:val="en-US"/>
+              </w:rPr>
             </w:pPr>
             <w:r>
               <w:rPr>
-                <w:lang w:bidi="fr-FR"/>
+                <w:lang w:val="en-US" w:bidi="fr-FR"/>
               </w:rPr>
               <w:t xml:space="preserve">compétences </w:t>
             </w:r>
             <w:r>
               <w:rPr>
-                <w:lang w:bidi="fr-FR"/>
+                <w:lang w:val="en-US" w:bidi="fr-FR"/>
               </w:rPr>
               <w:t>TECHNIQUES</w:t>
             </w:r>
@@ -1267,14 +1321,84 @@
               </w:numPr>
               <w:ind w:left="420" w:hanging="360"/>
               <w:rPr>
-                <w:rFonts w:eastAsiaTheme="minorEastAsia"/>
                 <w:b/>
                 <w:bCs/>
-                <w:color w:val="auto"/>
-                <w:sz w:val="18"/>
-                <w:lang w:eastAsia="ja-JP" w:bidi="fr-FR"/>
+                <w:lang w:val="en-US" w:bidi="fr-FR"/>
               </w:rPr>
             </w:pPr>
+            <w:r>
+              <w:rPr>
+                <w:rFonts w:eastAsiaTheme="minorEastAsia"/>
+                <w:b/>
+                <w:bCs/>
+                <w:color w:val="auto"/>
+                <w:sz w:val="18"/>
+                <w:lang w:val="en-US" w:eastAsia="ja-JP" w:bidi="fr-FR"/>
+              </w:rPr>
+              <w:t xml:space="preserve">                        </w:t>
+            </w:r>
+            <w:r>
+              <w:rPr>
+                <w:rFonts w:eastAsiaTheme="minorEastAsia"/>
+                <w:b/>
+                <w:bCs/>
+                <w:color w:val="auto"/>
+                <w:lang w:val="en-US" w:eastAsia="ja-JP" w:bidi="fr-FR"/>
+              </w:rPr>
+              <w:t>Front-</w:t>
+            </w:r>
+            <w:r>
+              <w:rPr>
+                <w:rFonts w:eastAsiaTheme="minorEastAsia"/>
+                <w:b/>
+                <w:bCs/>
+                <w:color w:val="auto"/>
+                <w:lang w:val="en-US" w:eastAsia="ja-JP" w:bidi="fr-FR"/>
+              </w:rPr>
+              <w:t>end:</w:t>
+            </w:r>
+            <w:r>
+              <w:rPr>
+                <w:b/>
+                <w:bCs/>
+                <w:lang w:val="en-US" w:bidi="fr-FR"/>
+              </w:rPr>
+              <w:t xml:space="preserve"> </w:t>
+            </w:r>
+            <w:r>
+              <w:rPr>
+                <w:b/>
+                <w:bCs/>
+                <w:lang w:val="en-US" w:bidi="fr-FR"/>
+              </w:rPr>
+              <w:t xml:space="preserve">      </w:t>
+            </w:r>
+            <w:r>
+              <w:rPr>
+                <w:b/>
+                <w:bCs/>
+                <w:lang w:val="en-US" w:bidi="fr-FR"/>
+              </w:rPr>
+              <w:t xml:space="preserve">           </w:t>
+            </w:r>
+            <w:r>
+              <w:rPr>
+                <w:b/>
+                <w:bCs/>
+                <w:lang w:val="en-US" w:bidi="fr-FR"/>
+              </w:rPr>
+              <w:t xml:space="preserve">            </w:t>
+            </w:r>
+            <w:r>
+              <w:rPr>
+                <w:rFonts w:eastAsiaTheme="minorEastAsia"/>
+                <w:b/>
+                <w:bCs/>
+                <w:color w:val="auto"/>
+                <w:lang w:val="en-US" w:eastAsia="ja-JP" w:bidi="fr-FR"/>
+              </w:rPr>
+              <w:t>Back-end</w:t>
+            </w:r>
           </w:p>
           <w:p>
             <w:pPr>
@@ -1285,91 +1409,182 @@
               </w:numPr>
               <w:ind w:left="420" w:hanging="360"/>
               <w:rPr>
+                <w:rFonts w:eastAsiaTheme="minorEastAsia"/>
+                <w:color w:val="auto"/>
+                <w:sz w:val="18"/>
+                <w:lang w:val="en-US" w:eastAsia="ja-JP" w:bidi="fr-FR"/>
+              </w:rPr>
+            </w:pPr>
+            <w:r>
+              <w:rPr>
+                <w:rFonts w:eastAsiaTheme="minorEastAsia"/>
+                <w:color w:val="auto"/>
+                <w:sz w:val="18"/>
+                <w:lang w:val="en-US" w:eastAsia="ja-JP" w:bidi="fr-FR"/>
+              </w:rPr>
+              <w:t xml:space="preserve">                       </w:t>
+            </w:r>
+            <w:r>
+              <w:rPr>
+                <w:rFonts w:eastAsiaTheme="minorEastAsia"/>
+                <w:color w:val="auto"/>
+                <w:sz w:val="18"/>
+                <w:lang w:val="en-US" w:eastAsia="ja-JP" w:bidi="fr-FR"/>
+              </w:rPr>
+              <w:t xml:space="preserve"> </w:t>
+            </w:r>
+            <w:r>
+              <w:rPr>
                 <w:b/>
                 <w:bCs/>
                 <w:sz w:val="18"/>
                 <w:szCs w:val="18"/>
-                <w:lang w:val="en-US" w:bidi="fr-FR"/>
-              </w:rPr>
-            </w:pPr>
-            <w:r>
-              <w:rPr>
-                <w:rFonts w:eastAsiaTheme="minorEastAsia"/>
-                <w:b/>
-                <w:bCs/>
-                <w:color w:val="auto"/>
-                <w:sz w:val="18"/>
-                <w:lang w:val="en-US" w:eastAsia="ja-JP" w:bidi="fr-FR"/>
-              </w:rPr>
-              <w:t>Front-</w:t>
-            </w:r>
-            <w:r>
-              <w:rPr>
-                <w:rFonts w:eastAsiaTheme="minorEastAsia"/>
-                <w:b/>
-                <w:bCs/>
-                <w:color w:val="auto"/>
-                <w:sz w:val="18"/>
-                <w:lang w:val="en-US" w:eastAsia="ja-JP" w:bidi="fr-FR"/>
-              </w:rPr>
-              <w:t>end:</w:t>
-            </w:r>
-            <w:r>
-              <w:rPr>
-                <w:b/>
-                <w:bCs/>
-                <w:sz w:val="18"/>
-                <w:szCs w:val="18"/>
-                <w:lang w:val="en-US" w:bidi="fr-FR"/>
-              </w:rPr>
-              <w:t xml:space="preserve"> </w:t>
-            </w:r>
-            <w:r>
-              <w:rPr>
-                <w:rFonts w:eastAsiaTheme="minorEastAsia"/>
-                <w:color w:val="auto"/>
-                <w:sz w:val="18"/>
-                <w:lang w:val="en-US" w:eastAsia="ja-JP" w:bidi="fr-FR"/>
-              </w:rPr>
-              <w:t xml:space="preserve">HTML5, CSS3/Sass, JavaScript, React, </w:t>
-            </w:r>
-            <w:proofErr w:type="gramStart"/>
-            <w:r>
-              <w:rPr>
-                <w:rFonts w:eastAsiaTheme="minorEastAsia"/>
-                <w:color w:val="auto"/>
-                <w:sz w:val="18"/>
-                <w:lang w:val="en-US" w:eastAsia="ja-JP" w:bidi="fr-FR"/>
-              </w:rPr>
-              <w:t>Vue.js</w:t>
-            </w:r>
-            <w:r>
-              <w:rPr>
-                <w:rFonts w:eastAsiaTheme="minorEastAsia"/>
-                <w:color w:val="auto"/>
-                <w:sz w:val="18"/>
-                <w:lang w:val="en-US" w:eastAsia="ja-JP" w:bidi="fr-FR"/>
-              </w:rPr>
-              <w:t xml:space="preserve"> </w:t>
-            </w:r>
-            <w:r>
-              <w:rPr>
-                <w:rFonts w:eastAsiaTheme="minorEastAsia"/>
-                <w:color w:val="auto"/>
-                <w:sz w:val="18"/>
-                <w:lang w:val="en-US" w:eastAsia="ja-JP" w:bidi="fr-FR"/>
-              </w:rPr>
-              <w:t>,</w:t>
-            </w:r>
-            <w:proofErr w:type="gramEnd"/>
-            <w:r>
-              <w:rPr>
-                <w:rFonts w:eastAsiaTheme="minorEastAsia"/>
-                <w:color w:val="auto"/>
-                <w:sz w:val="18"/>
-                <w:lang w:val="en-US" w:eastAsia="ja-JP" w:bidi="fr-FR"/>
-              </w:rPr>
-              <w:t xml:space="preserve"> Typescript</w:t>
+                <w:lang w:bidi="fr-FR"/>
+              </w:rPr>
+              <w:drawing>
+                <wp:inline distT="0" distB="0" distL="0" distR="0" wp14:anchorId="53FF4C85" wp14:editId="7D58FF88">
+                  <wp:extent cx="228600" cy="228600"/>
+                  <wp:effectExtent l="0" t="0" r="0" b="0"/>
+                  <wp:docPr id="9" name="Graphique 9"/>
+                  <wp:cNvGraphicFramePr>
+                    <a:graphicFrameLocks xmlns:a="http://schemas.openxmlformats.org/drawingml/2006/main" noChangeAspect="1"/>
+                  </wp:cNvGraphicFramePr>
+                  <a:graphic xmlns:a="http://schemas.openxmlformats.org/drawingml/2006/main">
+                    <a:graphicData uri="http://schemas.openxmlformats.org/drawingml/2006/picture">
+                      <pic:pic xmlns:pic="http://schemas.openxmlformats.org/drawingml/2006/picture">
+                        <pic:nvPicPr>
+                          <pic:cNvPr id="1" name=""/>
+                          <pic:cNvPicPr/>
+                        </pic:nvPicPr>
+                        <pic:blipFill>
+                          <a:blip r:embed="rId14">
+                            <a:extLst>
+                              <a:ext uri="{96DAC541-7B7A-43D3-8B79-37D633B846F1}">
+                                <asvg:svgBlip xmlns:asvg="http://schemas.microsoft.com/office/drawing/2016/SVG/main" r:embed="rId15"/>
+                              </a:ext>
+                            </a:extLst>
+                          </a:blip>
+                          <a:stretch>
+                            <a:fillRect/>
+                          </a:stretch>
+                        </pic:blipFill>
+                        <pic:spPr>
+                          <a:xfrm>
+                            <a:off x="0" y="0"/>
+                            <a:ext cx="228600" cy="228600"/>
+                          </a:xfrm>
+                          <a:prstGeom prst="rect">
+                            <a:avLst/>
+                          </a:prstGeom>
+                        </pic:spPr>
+                      </pic:pic>
+                    </a:graphicData>
+                  </a:graphic>
+                </wp:inline>
+              </w:drawing>
+            </w:r>
+            <w:r>
+              <w:rPr>
+                <w:rFonts w:eastAsiaTheme="minorEastAsia"/>
+                <w:color w:val="auto"/>
+                <w:sz w:val="18"/>
+                <w:lang w:val="en-US" w:eastAsia="ja-JP" w:bidi="fr-FR"/>
+              </w:rPr>
+              <w:t>HTML5</w:t>
+            </w:r>
+            <w:r>
+              <w:rPr>
+                <w:rFonts w:eastAsiaTheme="minorEastAsia"/>
+                <w:color w:val="auto"/>
+                <w:sz w:val="18"/>
+                <w:lang w:val="en-US" w:eastAsia="ja-JP" w:bidi="fr-FR"/>
+              </w:rPr>
+              <w:t xml:space="preserve">                               </w:t>
+            </w:r>
+            <w:r>
+              <w:rPr>
+                <w:rFonts w:eastAsiaTheme="minorEastAsia"/>
+                <w:color w:val="auto"/>
+                <w:sz w:val="18"/>
+                <w:lang w:val="en-US" w:eastAsia="ja-JP" w:bidi="fr-FR"/>
+              </w:rPr>
+              <w:t xml:space="preserve">      </w:t>
+            </w:r>
+            <w:r>
+              <w:rPr>
+                <w:rFonts w:eastAsiaTheme="minorEastAsia"/>
+                <w:color w:val="auto"/>
+                <w:sz w:val="18"/>
+                <w:lang w:val="en-US" w:eastAsia="ja-JP" w:bidi="fr-FR"/>
+              </w:rPr>
+              <w:t xml:space="preserve">  </w:t>
+            </w:r>
+            <w:r>
+              <w:rPr>
+                <w:rFonts w:eastAsiaTheme="minorEastAsia"/>
+                <w:color w:val="auto"/>
+                <w:sz w:val="18"/>
+                <w:lang w:eastAsia="ja-JP" w:bidi="fr-FR"/>
+              </w:rPr>
+              <w:drawing>
+                <wp:inline distT="0" distB="0" distL="0" distR="0" wp14:anchorId="6E587BF9" wp14:editId="1991241F">
+                  <wp:extent cx="228600" cy="228600"/>
+                  <wp:effectExtent l="0" t="0" r="0" b="0"/>
+                  <wp:docPr id="14" name="Graphique 14"/>
+                  <wp:cNvGraphicFramePr>
+                    <a:graphicFrameLocks xmlns:a="http://schemas.openxmlformats.org/drawingml/2006/main" noChangeAspect="1"/>
+                  </wp:cNvGraphicFramePr>
+                  <a:graphic xmlns:a="http://schemas.openxmlformats.org/drawingml/2006/main">
+                    <a:graphicData uri="http://schemas.openxmlformats.org/drawingml/2006/picture">
+                      <pic:pic xmlns:pic="http://schemas.openxmlformats.org/drawingml/2006/picture">
+                        <pic:nvPicPr>
+                          <pic:cNvPr id="1" name=""/>
+                          <pic:cNvPicPr/>
+                        </pic:nvPicPr>
+                        <pic:blipFill>
+                          <a:blip r:embed="rId16">
+                            <a:extLst>
+                              <a:ext uri="{96DAC541-7B7A-43D3-8B79-37D633B846F1}">
+                                <asvg:svgBlip xmlns:asvg="http://schemas.microsoft.com/office/drawing/2016/SVG/main" r:embed="rId17"/>
+                              </a:ext>
+                            </a:extLst>
+                          </a:blip>
+                          <a:stretch>
+                            <a:fillRect/>
+                          </a:stretch>
+                        </pic:blipFill>
+                        <pic:spPr>
+                          <a:xfrm>
+                            <a:off x="0" y="0"/>
+                            <a:ext cx="228600" cy="228600"/>
+                          </a:xfrm>
+                          <a:prstGeom prst="rect">
+                            <a:avLst/>
+                          </a:prstGeom>
+                        </pic:spPr>
+                      </pic:pic>
+                    </a:graphicData>
+                  </a:graphic>
+                </wp:inline>
+              </w:drawing>
+            </w:r>
+            <w:r>
+              <w:rPr>
+                <w:rFonts w:eastAsiaTheme="minorEastAsia"/>
+                <w:color w:val="auto"/>
+                <w:sz w:val="18"/>
+                <w:lang w:val="en-US" w:eastAsia="ja-JP" w:bidi="fr-FR"/>
+              </w:rPr>
+              <w:t xml:space="preserve">  </w:t>
+            </w:r>
+            <w:r>
+              <w:rPr>
+                <w:rFonts w:eastAsiaTheme="minorEastAsia"/>
+                <w:color w:val="auto"/>
+                <w:sz w:val="18"/>
+                <w:lang w:val="en-US" w:eastAsia="ja-JP" w:bidi="fr-FR"/>
+              </w:rPr>
+              <w:t>Node.js,</w:t>
             </w:r>
           </w:p>
           <w:p>
@@ -1381,13 +1596,218 @@
               </w:numPr>
               <w:ind w:left="420" w:hanging="360"/>
               <w:rPr>
-                <w:b/>
-                <w:bCs/>
-                <w:sz w:val="18"/>
-                <w:szCs w:val="18"/>
-                <w:lang w:val="en-US" w:bidi="fr-FR"/>
+                <w:rFonts w:eastAsiaTheme="minorEastAsia"/>
+                <w:color w:val="auto"/>
+                <w:sz w:val="18"/>
+                <w:lang w:val="en-US" w:eastAsia="ja-JP" w:bidi="fr-FR"/>
               </w:rPr>
             </w:pPr>
+            <w:r>
+              <w:rPr>
+                <w:rFonts w:eastAsiaTheme="minorEastAsia"/>
+                <w:color w:val="auto"/>
+                <w:sz w:val="18"/>
+                <w:lang w:val="en-US" w:eastAsia="ja-JP" w:bidi="fr-FR"/>
+              </w:rPr>
+              <w:t xml:space="preserve"> </w:t>
+            </w:r>
+            <w:r>
+              <w:rPr>
+                <w:rFonts w:eastAsiaTheme="minorEastAsia"/>
+                <w:color w:val="auto"/>
+                <w:sz w:val="18"/>
+                <w:lang w:val="en-US" w:eastAsia="ja-JP" w:bidi="fr-FR"/>
+              </w:rPr>
+              <w:t xml:space="preserve">                     </w:t>
+            </w:r>
+            <w:r>
+              <w:rPr>
+                <w:rFonts w:eastAsiaTheme="minorEastAsia"/>
+                <w:color w:val="auto"/>
+                <w:sz w:val="18"/>
+                <w:lang w:val="en-US" w:eastAsia="ja-JP" w:bidi="fr-FR"/>
+              </w:rPr>
+              <w:t xml:space="preserve"> </w:t>
+            </w:r>
+            <w:r>
+              <w:rPr>
+                <w:rFonts w:eastAsiaTheme="minorEastAsia"/>
+                <w:color w:val="auto"/>
+                <w:sz w:val="18"/>
+                <w:lang w:val="en-US" w:eastAsia="ja-JP" w:bidi="fr-FR"/>
+              </w:rPr>
+              <w:t xml:space="preserve">  </w:t>
+            </w:r>
+            <w:r>
+              <w:rPr>
+                <w:rFonts w:eastAsiaTheme="minorEastAsia"/>
+                <w:color w:val="auto"/>
+                <w:sz w:val="18"/>
+                <w:lang w:val="en-US" w:eastAsia="ja-JP" w:bidi="fr-FR"/>
+              </w:rPr>
+              <w:drawing>
+                <wp:inline distT="0" distB="0" distL="0" distR="0" wp14:anchorId="1BB33590" wp14:editId="6867D561">
+                  <wp:extent cx="228600" cy="228600"/>
+                  <wp:effectExtent l="0" t="0" r="0" b="0"/>
+                  <wp:docPr id="6" name="Graphique 6"/>
+                  <wp:cNvGraphicFramePr>
+                    <a:graphicFrameLocks xmlns:a="http://schemas.openxmlformats.org/drawingml/2006/main" noChangeAspect="1"/>
+                  </wp:cNvGraphicFramePr>
+                  <a:graphic xmlns:a="http://schemas.openxmlformats.org/drawingml/2006/main">
+                    <a:graphicData uri="http://schemas.openxmlformats.org/drawingml/2006/picture">
+                      <pic:pic xmlns:pic="http://schemas.openxmlformats.org/drawingml/2006/picture">
+                        <pic:nvPicPr>
+                          <pic:cNvPr id="1" name=""/>
+                          <pic:cNvPicPr/>
+                        </pic:nvPicPr>
+                        <pic:blipFill>
+                          <a:blip r:embed="rId18">
+                            <a:extLst>
+                              <a:ext uri="{96DAC541-7B7A-43D3-8B79-37D633B846F1}">
+                                <asvg:svgBlip xmlns:asvg="http://schemas.microsoft.com/office/drawing/2016/SVG/main" r:embed="rId19"/>
+                              </a:ext>
+                            </a:extLst>
+                          </a:blip>
+                          <a:stretch>
+                            <a:fillRect/>
+                          </a:stretch>
+                        </pic:blipFill>
+                        <pic:spPr>
+                          <a:xfrm>
+                            <a:off x="0" y="0"/>
+                            <a:ext cx="228600" cy="228600"/>
+                          </a:xfrm>
+                          <a:prstGeom prst="rect">
+                            <a:avLst/>
+                          </a:prstGeom>
+                        </pic:spPr>
+                      </pic:pic>
+                    </a:graphicData>
+                  </a:graphic>
+                </wp:inline>
+              </w:drawing>
+            </w:r>
+            <w:r>
+              <w:rPr>
+                <w:rFonts w:eastAsiaTheme="minorEastAsia"/>
+                <w:color w:val="auto"/>
+                <w:sz w:val="18"/>
+                <w:lang w:val="en-US" w:eastAsia="ja-JP" w:bidi="fr-FR"/>
+              </w:rPr>
+              <w:t xml:space="preserve"> </w:t>
+            </w:r>
+            <w:r>
+              <w:rPr>
+                <w:rFonts w:eastAsiaTheme="minorEastAsia"/>
+                <w:color w:val="auto"/>
+                <w:sz w:val="18"/>
+                <w:lang w:val="en-US" w:eastAsia="ja-JP" w:bidi="fr-FR"/>
+              </w:rPr>
+              <w:t>CSS3/Sass</w:t>
+            </w:r>
+            <w:r>
+              <w:rPr>
+                <w:rFonts w:eastAsiaTheme="minorEastAsia"/>
+                <w:color w:val="auto"/>
+                <w:sz w:val="18"/>
+                <w:lang w:val="en-US" w:eastAsia="ja-JP" w:bidi="fr-FR"/>
+              </w:rPr>
+              <w:t xml:space="preserve">                          </w:t>
+            </w:r>
+            <w:r>
+              <w:rPr>
+                <w:rFonts w:eastAsiaTheme="minorEastAsia"/>
+                <w:color w:val="auto"/>
+                <w:sz w:val="18"/>
+                <w:lang w:val="en-US" w:eastAsia="ja-JP" w:bidi="fr-FR"/>
+              </w:rPr>
+              <w:t xml:space="preserve"> </w:t>
+            </w:r>
+            <w:r>
+              <w:rPr>
+                <w:rFonts w:eastAsiaTheme="minorEastAsia"/>
+                <w:color w:val="auto"/>
+                <w:sz w:val="18"/>
+                <w:lang w:val="en-US" w:eastAsia="ja-JP" w:bidi="fr-FR"/>
+              </w:rPr>
+              <w:t xml:space="preserve"> </w:t>
+            </w:r>
+            <w:r>
+              <w:rPr>
+                <w:rFonts w:eastAsiaTheme="minorEastAsia"/>
+                <w:color w:val="auto"/>
+                <w:sz w:val="18"/>
+                <w:lang w:val="en-US" w:eastAsia="ja-JP" w:bidi="fr-FR"/>
+              </w:rPr>
+              <w:t xml:space="preserve">   </w:t>
+            </w:r>
+            <w:r>
+              <w:rPr>
+                <w:rFonts w:eastAsiaTheme="minorEastAsia"/>
+                <w:color w:val="auto"/>
+                <w:sz w:val="18"/>
+                <w:lang w:val="en-US" w:eastAsia="ja-JP" w:bidi="fr-FR"/>
+              </w:rPr>
+              <w:drawing>
+                <wp:inline distT="0" distB="0" distL="0" distR="0" wp14:anchorId="4314E767" wp14:editId="3FB3F5B3">
+                  <wp:extent cx="228600" cy="228600"/>
+                  <wp:effectExtent l="0" t="0" r="0" b="0"/>
+                  <wp:docPr id="15" name="Graphique 15"/>
+                  <wp:cNvGraphicFramePr>
+                    <a:graphicFrameLocks xmlns:a="http://schemas.openxmlformats.org/drawingml/2006/main" noChangeAspect="1"/>
+                  </wp:cNvGraphicFramePr>
+                  <a:graphic xmlns:a="http://schemas.openxmlformats.org/drawingml/2006/main">
+                    <a:graphicData uri="http://schemas.openxmlformats.org/drawingml/2006/picture">
+                      <pic:pic xmlns:pic="http://schemas.openxmlformats.org/drawingml/2006/picture">
+                        <pic:nvPicPr>
+                          <pic:cNvPr id="1" name=""/>
+                          <pic:cNvPicPr/>
+                        </pic:nvPicPr>
+                        <pic:blipFill>
+                          <a:blip r:embed="rId20">
+                            <a:extLst>
+                              <a:ext uri="{96DAC541-7B7A-43D3-8B79-37D633B846F1}">
+                                <asvg:svgBlip xmlns:asvg="http://schemas.microsoft.com/office/drawing/2016/SVG/main" r:embed="rId21"/>
+                              </a:ext>
+                            </a:extLst>
+                          </a:blip>
+                          <a:stretch>
+                            <a:fillRect/>
+                          </a:stretch>
+                        </pic:blipFill>
+                        <pic:spPr>
+                          <a:xfrm>
+                            <a:off x="0" y="0"/>
+                            <a:ext cx="228600" cy="228600"/>
+                          </a:xfrm>
+                          <a:prstGeom prst="rect">
+                            <a:avLst/>
+                          </a:prstGeom>
+                        </pic:spPr>
+                      </pic:pic>
+                    </a:graphicData>
+                  </a:graphic>
+                </wp:inline>
+              </w:drawing>
+            </w:r>
+            <w:r>
+              <w:rPr>
+                <w:rFonts w:eastAsiaTheme="minorEastAsia"/>
+                <w:color w:val="auto"/>
+                <w:sz w:val="18"/>
+                <w:lang w:val="en-US" w:eastAsia="ja-JP" w:bidi="fr-FR"/>
+              </w:rPr>
+              <w:t xml:space="preserve">   </w:t>
+            </w:r>
+            <w:r>
+              <w:rPr>
+                <w:rFonts w:eastAsiaTheme="minorEastAsia"/>
+                <w:color w:val="auto"/>
+                <w:sz w:val="18"/>
+                <w:lang w:val="en-US" w:eastAsia="ja-JP" w:bidi="fr-FR"/>
+              </w:rPr>
+              <w:t>Express</w:t>
+            </w:r>
           </w:p>
           <w:p>
             <w:pPr>
@@ -1398,44 +1818,94 @@
               </w:numPr>
               <w:ind w:left="420" w:hanging="360"/>
               <w:rPr>
-                <w:b/>
-                <w:bCs/>
-                <w:sz w:val="18"/>
-                <w:szCs w:val="18"/>
-                <w:lang w:val="en-US" w:bidi="fr-FR"/>
+                <w:rFonts w:eastAsiaTheme="minorEastAsia"/>
+                <w:color w:val="auto"/>
+                <w:sz w:val="18"/>
+                <w:lang w:val="en-US" w:eastAsia="ja-JP" w:bidi="fr-FR"/>
               </w:rPr>
             </w:pPr>
             <w:r>
               <w:rPr>
                 <w:rFonts w:eastAsiaTheme="minorEastAsia"/>
-                <w:b/>
-                <w:bCs/>
+                <w:color w:val="auto"/>
+                <w:sz w:val="18"/>
+                <w:lang w:val="en-US" w:eastAsia="ja-JP" w:bidi="fr-FR"/>
+              </w:rPr>
+              <w:t xml:space="preserve">                         </w:t>
+            </w:r>
+            <w:r>
+              <w:rPr>
+                <w:rFonts w:eastAsiaTheme="minorEastAsia"/>
                 <w:color w:val="auto"/>
                 <w:sz w:val="18"/>
                 <w:lang w:eastAsia="ja-JP" w:bidi="fr-FR"/>
               </w:rPr>
-              <w:t>Back-</w:t>
-            </w:r>
-            <w:proofErr w:type="gramStart"/>
-            <w:r>
-              <w:rPr>
-                <w:rFonts w:eastAsiaTheme="minorEastAsia"/>
-                <w:b/>
-                <w:bCs/>
-                <w:color w:val="auto"/>
-                <w:sz w:val="18"/>
-                <w:lang w:eastAsia="ja-JP" w:bidi="fr-FR"/>
-              </w:rPr>
-              <w:t>end:</w:t>
-            </w:r>
-            <w:proofErr w:type="gramEnd"/>
-            <w:r>
-              <w:rPr>
-                <w:b/>
-                <w:bCs/>
-                <w:sz w:val="18"/>
-                <w:szCs w:val="18"/>
-                <w:lang w:val="en-US" w:bidi="fr-FR"/>
+              <w:drawing>
+                <wp:inline distT="0" distB="0" distL="0" distR="0" wp14:anchorId="2DD65CE4" wp14:editId="44D8F65C">
+                  <wp:extent cx="228600" cy="228600"/>
+                  <wp:effectExtent l="0" t="0" r="0" b="0"/>
+                  <wp:docPr id="5" name="Graphique 5"/>
+                  <wp:cNvGraphicFramePr>
+                    <a:graphicFrameLocks xmlns:a="http://schemas.openxmlformats.org/drawingml/2006/main" noChangeAspect="1"/>
+                  </wp:cNvGraphicFramePr>
+                  <a:graphic xmlns:a="http://schemas.openxmlformats.org/drawingml/2006/main">
+                    <a:graphicData uri="http://schemas.openxmlformats.org/drawingml/2006/picture">
+                      <pic:pic xmlns:pic="http://schemas.openxmlformats.org/drawingml/2006/picture">
+                        <pic:nvPicPr>
+                          <pic:cNvPr id="1" name=""/>
+                          <pic:cNvPicPr/>
+                        </pic:nvPicPr>
+                        <pic:blipFill>
+                          <a:blip r:embed="rId22">
+                            <a:extLst>
+                              <a:ext uri="{96DAC541-7B7A-43D3-8B79-37D633B846F1}">
+                                <asvg:svgBlip xmlns:asvg="http://schemas.microsoft.com/office/drawing/2016/SVG/main" r:embed="rId23"/>
+                              </a:ext>
+                            </a:extLst>
+                          </a:blip>
+                          <a:stretch>
+                            <a:fillRect/>
+                          </a:stretch>
+                        </pic:blipFill>
+                        <pic:spPr>
+                          <a:xfrm>
+                            <a:off x="0" y="0"/>
+                            <a:ext cx="228600" cy="228600"/>
+                          </a:xfrm>
+                          <a:prstGeom prst="rect">
+                            <a:avLst/>
+                          </a:prstGeom>
+                        </pic:spPr>
+                      </pic:pic>
+                    </a:graphicData>
+                  </a:graphic>
+                </wp:inline>
+              </w:drawing>
+            </w:r>
+            <w:r>
+              <w:rPr>
+                <w:rFonts w:eastAsiaTheme="minorEastAsia"/>
+                <w:color w:val="auto"/>
+                <w:sz w:val="18"/>
+                <w:lang w:val="en-US" w:eastAsia="ja-JP" w:bidi="fr-FR"/>
+              </w:rPr>
+              <w:t>JavaScript</w:t>
+            </w:r>
+            <w:r>
+              <w:rPr>
+                <w:rFonts w:eastAsiaTheme="minorEastAsia"/>
+                <w:color w:val="auto"/>
+                <w:sz w:val="18"/>
+                <w:lang w:val="en-US" w:eastAsia="ja-JP" w:bidi="fr-FR"/>
+              </w:rPr>
+              <w:t xml:space="preserve">                             </w:t>
+            </w:r>
+            <w:r>
+              <w:rPr>
+                <w:rFonts w:eastAsiaTheme="minorEastAsia"/>
+                <w:color w:val="auto"/>
+                <w:sz w:val="18"/>
+                <w:lang w:val="en-US" w:eastAsia="ja-JP" w:bidi="fr-FR"/>
               </w:rPr>
               <w:t xml:space="preserve"> </w:t>
             </w:r>
@@ -1444,29 +1914,67 @@
                 <w:rFonts w:eastAsiaTheme="minorEastAsia"/>
                 <w:color w:val="auto"/>
                 <w:sz w:val="18"/>
-                <w:lang w:eastAsia="ja-JP" w:bidi="fr-FR"/>
-              </w:rPr>
-              <w:t xml:space="preserve">Node.js, Express, PostgreSQL, gestion </w:t>
-            </w:r>
-            <w:proofErr w:type="spellStart"/>
-            <w:r>
-              <w:rPr>
-                <w:rFonts w:eastAsiaTheme="minorEastAsia"/>
-                <w:color w:val="auto"/>
-                <w:sz w:val="18"/>
-                <w:lang w:eastAsia="ja-JP" w:bidi="fr-FR"/>
-              </w:rPr>
-              <w:t>d’API</w:t>
-            </w:r>
-            <w:proofErr w:type="spellEnd"/>
-            <w:r>
-              <w:rPr>
-                <w:rFonts w:eastAsiaTheme="minorEastAsia"/>
-                <w:color w:val="auto"/>
-                <w:sz w:val="18"/>
-                <w:lang w:eastAsia="ja-JP" w:bidi="fr-FR"/>
-              </w:rPr>
-              <w:t xml:space="preserve"> REST</w:t>
+                <w:lang w:val="en-US" w:eastAsia="ja-JP" w:bidi="fr-FR"/>
+              </w:rPr>
+              <w:t xml:space="preserve">  </w:t>
+            </w:r>
+            <w:r>
+              <w:rPr>
+                <w:rFonts w:eastAsiaTheme="minorEastAsia"/>
+                <w:color w:val="auto"/>
+                <w:sz w:val="18"/>
+                <w:lang w:val="en-US" w:eastAsia="ja-JP" w:bidi="fr-FR"/>
+              </w:rPr>
+              <w:drawing>
+                <wp:inline distT="0" distB="0" distL="0" distR="0" wp14:anchorId="7D2FB48C" wp14:editId="7B498A73">
+                  <wp:extent cx="228600" cy="228600"/>
+                  <wp:effectExtent l="0" t="0" r="0" b="0"/>
+                  <wp:docPr id="16" name="Graphique 16"/>
+                  <wp:cNvGraphicFramePr>
+                    <a:graphicFrameLocks xmlns:a="http://schemas.openxmlformats.org/drawingml/2006/main" noChangeAspect="1"/>
+                  </wp:cNvGraphicFramePr>
+                  <a:graphic xmlns:a="http://schemas.openxmlformats.org/drawingml/2006/main">
+                    <a:graphicData uri="http://schemas.openxmlformats.org/drawingml/2006/picture">
+                      <pic:pic xmlns:pic="http://schemas.openxmlformats.org/drawingml/2006/picture">
+                        <pic:nvPicPr>
+                          <pic:cNvPr id="1" name=""/>
+                          <pic:cNvPicPr/>
+                        </pic:nvPicPr>
+                        <pic:blipFill>
+                          <a:blip r:embed="rId24">
+                            <a:extLst>
+                              <a:ext uri="{96DAC541-7B7A-43D3-8B79-37D633B846F1}">
+                                <asvg:svgBlip xmlns:asvg="http://schemas.microsoft.com/office/drawing/2016/SVG/main" r:embed="rId25"/>
+                              </a:ext>
+                            </a:extLst>
+                          </a:blip>
+                          <a:stretch>
+                            <a:fillRect/>
+                          </a:stretch>
+                        </pic:blipFill>
+                        <pic:spPr>
+                          <a:xfrm>
+                            <a:off x="0" y="0"/>
+                            <a:ext cx="228600" cy="228600"/>
+                          </a:xfrm>
+                          <a:prstGeom prst="rect">
+                            <a:avLst/>
+                          </a:prstGeom>
+                        </pic:spPr>
+                      </pic:pic>
+                    </a:graphicData>
+                  </a:graphic>
+                </wp:inline>
+              </w:drawing>
+            </w:r>
+            <w:r>
+              <w:rPr>
+                <w:rFonts w:eastAsiaTheme="minorEastAsia"/>
+                <w:color w:val="auto"/>
+                <w:sz w:val="18"/>
+                <w:lang w:val="en-US" w:eastAsia="ja-JP" w:bidi="fr-FR"/>
+              </w:rPr>
+              <w:t>PostgreSQL</w:t>
             </w:r>
           </w:p>
           <w:p>
@@ -1478,12 +1986,657 @@
               </w:numPr>
               <w:ind w:left="420" w:hanging="360"/>
               <w:rPr>
-                <w:color w:val="000000" w:themeColor="text1"/>
+                <w:rFonts w:eastAsiaTheme="minorEastAsia"/>
+                <w:color w:val="auto"/>
+                <w:sz w:val="18"/>
+                <w:lang w:val="en-US" w:eastAsia="ja-JP" w:bidi="fr-FR"/>
+              </w:rPr>
+            </w:pPr>
+            <w:r>
+              <w:rPr>
+                <w:rFonts w:eastAsiaTheme="minorEastAsia"/>
+                <w:color w:val="auto"/>
+                <w:sz w:val="18"/>
+                <w:lang w:val="en-US" w:eastAsia="ja-JP" w:bidi="fr-FR"/>
+              </w:rPr>
+              <w:t xml:space="preserve">                    </w:t>
+            </w:r>
+            <w:r>
+              <w:rPr>
+                <w:rFonts w:eastAsiaTheme="minorEastAsia"/>
+                <w:color w:val="auto"/>
+                <w:sz w:val="18"/>
+                <w:lang w:val="en-US" w:eastAsia="ja-JP" w:bidi="fr-FR"/>
+              </w:rPr>
+              <w:t xml:space="preserve"> </w:t>
+            </w:r>
+            <w:r>
+              <w:rPr>
+                <w:rFonts w:eastAsiaTheme="minorEastAsia"/>
+                <w:color w:val="auto"/>
+                <w:sz w:val="18"/>
+                <w:lang w:val="en-US" w:eastAsia="ja-JP" w:bidi="fr-FR"/>
+              </w:rPr>
+              <w:t xml:space="preserve">    </w:t>
+            </w:r>
+            <w:r>
+              <w:rPr>
+                <w:rFonts w:eastAsiaTheme="minorEastAsia"/>
+                <w:color w:val="auto"/>
+                <w:sz w:val="18"/>
+                <w:lang w:val="en-US" w:eastAsia="ja-JP" w:bidi="fr-FR"/>
+              </w:rPr>
+              <w:drawing>
+                <wp:inline distT="0" distB="0" distL="0" distR="0" wp14:anchorId="53F77D5C" wp14:editId="1D2A631E">
+                  <wp:extent cx="228600" cy="228600"/>
+                  <wp:effectExtent l="0" t="0" r="0" b="0"/>
+                  <wp:docPr id="10" name="Graphique 10"/>
+                  <wp:cNvGraphicFramePr>
+                    <a:graphicFrameLocks xmlns:a="http://schemas.openxmlformats.org/drawingml/2006/main" noChangeAspect="1"/>
+                  </wp:cNvGraphicFramePr>
+                  <a:graphic xmlns:a="http://schemas.openxmlformats.org/drawingml/2006/main">
+                    <a:graphicData uri="http://schemas.openxmlformats.org/drawingml/2006/picture">
+                      <pic:pic xmlns:pic="http://schemas.openxmlformats.org/drawingml/2006/picture">
+                        <pic:nvPicPr>
+                          <pic:cNvPr id="1" name=""/>
+                          <pic:cNvPicPr/>
+                        </pic:nvPicPr>
+                        <pic:blipFill>
+                          <a:blip r:embed="rId26">
+                            <a:extLst>
+                              <a:ext uri="{96DAC541-7B7A-43D3-8B79-37D633B846F1}">
+                                <asvg:svgBlip xmlns:asvg="http://schemas.microsoft.com/office/drawing/2016/SVG/main" r:embed="rId27"/>
+                              </a:ext>
+                            </a:extLst>
+                          </a:blip>
+                          <a:stretch>
+                            <a:fillRect/>
+                          </a:stretch>
+                        </pic:blipFill>
+                        <pic:spPr>
+                          <a:xfrm>
+                            <a:off x="0" y="0"/>
+                            <a:ext cx="228600" cy="228600"/>
+                          </a:xfrm>
+                          <a:prstGeom prst="rect">
+                            <a:avLst/>
+                          </a:prstGeom>
+                        </pic:spPr>
+                      </pic:pic>
+                    </a:graphicData>
+                  </a:graphic>
+                </wp:inline>
+              </w:drawing>
+            </w:r>
+            <w:r>
+              <w:rPr>
+                <w:rFonts w:eastAsiaTheme="minorEastAsia"/>
+                <w:color w:val="auto"/>
+                <w:sz w:val="18"/>
+                <w:lang w:val="en-US" w:eastAsia="ja-JP" w:bidi="fr-FR"/>
+              </w:rPr>
+              <w:t xml:space="preserve"> </w:t>
+            </w:r>
+            <w:r>
+              <w:rPr>
+                <w:rFonts w:eastAsiaTheme="minorEastAsia"/>
+                <w:color w:val="auto"/>
+                <w:sz w:val="18"/>
+                <w:lang w:val="en-US" w:eastAsia="ja-JP" w:bidi="fr-FR"/>
+              </w:rPr>
+              <w:t xml:space="preserve">React </w:t>
+            </w:r>
+            <w:r>
+              <w:rPr>
+                <w:rFonts w:eastAsiaTheme="minorEastAsia"/>
+                <w:color w:val="auto"/>
+                <w:sz w:val="18"/>
+                <w:lang w:val="en-US" w:eastAsia="ja-JP" w:bidi="fr-FR"/>
+              </w:rPr>
+              <w:t xml:space="preserve"> </w:t>
+            </w:r>
+            <w:r>
+              <w:rPr>
+                <w:rFonts w:eastAsiaTheme="minorEastAsia"/>
+                <w:color w:val="auto"/>
+                <w:sz w:val="18"/>
+                <w:lang w:val="en-US" w:eastAsia="ja-JP" w:bidi="fr-FR"/>
+              </w:rPr>
+              <w:t xml:space="preserve">                         </w:t>
+            </w:r>
+            <w:r>
+              <w:rPr>
+                <w:rFonts w:eastAsiaTheme="minorEastAsia"/>
+                <w:color w:val="auto"/>
+                <w:sz w:val="18"/>
+                <w:lang w:val="en-US" w:eastAsia="ja-JP" w:bidi="fr-FR"/>
+              </w:rPr>
+              <w:t xml:space="preserve">   </w:t>
+            </w:r>
+            <w:r>
+              <w:rPr>
+                <w:rFonts w:eastAsiaTheme="minorEastAsia"/>
+                <w:color w:val="auto"/>
+                <w:sz w:val="18"/>
+                <w:lang w:val="en-US" w:eastAsia="ja-JP" w:bidi="fr-FR"/>
+              </w:rPr>
+              <w:t xml:space="preserve">       </w:t>
+            </w:r>
+            <w:r>
+              <w:rPr>
+                <w:rFonts w:eastAsiaTheme="minorEastAsia"/>
+                <w:color w:val="auto"/>
+                <w:sz w:val="18"/>
+                <w:lang w:val="en-US" w:eastAsia="ja-JP" w:bidi="fr-FR"/>
+              </w:rPr>
+              <w:t xml:space="preserve">   </w:t>
+            </w:r>
+            <w:r>
+              <w:rPr>
+                <w:rStyle w:val="lev"/>
+                <w:bCs w:val="0"/>
+                <w:caps/>
+                <w:noProof/>
+              </w:rPr>
+              <w:drawing>
+                <wp:inline distT="0" distB="0" distL="0" distR="0" wp14:anchorId="5B0909B8" wp14:editId="6FE24101">
+                  <wp:extent cx="228600" cy="228600"/>
+                  <wp:effectExtent l="0" t="0" r="0" b="0"/>
+                  <wp:docPr id="21" name="Graphique 21"/>
+                  <wp:cNvGraphicFramePr>
+                    <a:graphicFrameLocks xmlns:a="http://schemas.openxmlformats.org/drawingml/2006/main" noChangeAspect="1"/>
+                  </wp:cNvGraphicFramePr>
+                  <a:graphic xmlns:a="http://schemas.openxmlformats.org/drawingml/2006/main">
+                    <a:graphicData uri="http://schemas.openxmlformats.org/drawingml/2006/picture">
+                      <pic:pic xmlns:pic="http://schemas.openxmlformats.org/drawingml/2006/picture">
+                        <pic:nvPicPr>
+                          <pic:cNvPr id="1" name=""/>
+                          <pic:cNvPicPr/>
+                        </pic:nvPicPr>
+                        <pic:blipFill>
+                          <a:blip r:embed="rId28">
+                            <a:extLst>
+                              <a:ext uri="{96DAC541-7B7A-43D3-8B79-37D633B846F1}">
+                                <asvg:svgBlip xmlns:asvg="http://schemas.microsoft.com/office/drawing/2016/SVG/main" r:embed="rId29"/>
+                              </a:ext>
+                            </a:extLst>
+                          </a:blip>
+                          <a:stretch>
+                            <a:fillRect/>
+                          </a:stretch>
+                        </pic:blipFill>
+                        <pic:spPr>
+                          <a:xfrm>
+                            <a:off x="0" y="0"/>
+                            <a:ext cx="228600" cy="228600"/>
+                          </a:xfrm>
+                          <a:prstGeom prst="rect">
+                            <a:avLst/>
+                          </a:prstGeom>
+                        </pic:spPr>
+                      </pic:pic>
+                    </a:graphicData>
+                  </a:graphic>
+                </wp:inline>
+              </w:drawing>
+            </w:r>
+            <w:r>
+              <w:rPr>
+                <w:rFonts w:eastAsiaTheme="minorEastAsia"/>
+                <w:color w:val="auto"/>
+                <w:sz w:val="18"/>
+                <w:lang w:val="en-US" w:eastAsia="ja-JP" w:bidi="fr-FR"/>
+              </w:rPr>
+              <w:t>REST</w:t>
+            </w:r>
+            <w:r>
+              <w:rPr>
+                <w:rFonts w:eastAsiaTheme="minorEastAsia"/>
+                <w:color w:val="auto"/>
+                <w:sz w:val="18"/>
+                <w:lang w:val="en-US" w:eastAsia="ja-JP" w:bidi="fr-FR"/>
+              </w:rPr>
+              <w:t xml:space="preserve"> API</w:t>
+            </w:r>
+          </w:p>
+          <w:p>
+            <w:pPr>
+              <w:pStyle w:val="Listepuces"/>
+              <w:numPr>
+                <w:ilvl w:val="0"/>
+                <w:numId w:val="0"/>
+              </w:numPr>
+              <w:ind w:left="420" w:hanging="360"/>
+              <w:rPr>
+                <w:rFonts w:eastAsiaTheme="minorEastAsia"/>
+                <w:color w:val="auto"/>
+                <w:sz w:val="18"/>
+                <w:lang w:val="en-US" w:eastAsia="ja-JP" w:bidi="fr-FR"/>
+              </w:rPr>
+            </w:pPr>
+            <w:r>
+              <w:rPr>
+                <w:rFonts w:eastAsiaTheme="minorEastAsia"/>
+                <w:color w:val="auto"/>
+                <w:sz w:val="18"/>
+                <w:lang w:val="en-US" w:eastAsia="ja-JP" w:bidi="fr-FR"/>
+              </w:rPr>
+              <w:t xml:space="preserve">                         </w:t>
+            </w:r>
+            <w:r>
+              <w:rPr>
+                <w:rFonts w:eastAsiaTheme="minorEastAsia"/>
+                <w:color w:val="auto"/>
+                <w:sz w:val="18"/>
+                <w:lang w:val="en-US" w:eastAsia="ja-JP" w:bidi="fr-FR"/>
+              </w:rPr>
+              <w:drawing>
+                <wp:inline distT="0" distB="0" distL="0" distR="0" wp14:anchorId="5E5F452E" wp14:editId="56439DF9">
+                  <wp:extent cx="228600" cy="228600"/>
+                  <wp:effectExtent l="0" t="0" r="0" b="0"/>
+                  <wp:docPr id="11" name="Graphique 11"/>
+                  <wp:cNvGraphicFramePr>
+                    <a:graphicFrameLocks xmlns:a="http://schemas.openxmlformats.org/drawingml/2006/main" noChangeAspect="1"/>
+                  </wp:cNvGraphicFramePr>
+                  <a:graphic xmlns:a="http://schemas.openxmlformats.org/drawingml/2006/main">
+                    <a:graphicData uri="http://schemas.openxmlformats.org/drawingml/2006/picture">
+                      <pic:pic xmlns:pic="http://schemas.openxmlformats.org/drawingml/2006/picture">
+                        <pic:nvPicPr>
+                          <pic:cNvPr id="1" name=""/>
+                          <pic:cNvPicPr/>
+                        </pic:nvPicPr>
+                        <pic:blipFill>
+                          <a:blip r:embed="rId30">
+                            <a:extLst>
+                              <a:ext uri="{96DAC541-7B7A-43D3-8B79-37D633B846F1}">
+                                <asvg:svgBlip xmlns:asvg="http://schemas.microsoft.com/office/drawing/2016/SVG/main" r:embed="rId31"/>
+                              </a:ext>
+                            </a:extLst>
+                          </a:blip>
+                          <a:stretch>
+                            <a:fillRect/>
+                          </a:stretch>
+                        </pic:blipFill>
+                        <pic:spPr>
+                          <a:xfrm>
+                            <a:off x="0" y="0"/>
+                            <a:ext cx="228600" cy="228600"/>
+                          </a:xfrm>
+                          <a:prstGeom prst="rect">
+                            <a:avLst/>
+                          </a:prstGeom>
+                        </pic:spPr>
+                      </pic:pic>
+                    </a:graphicData>
+                  </a:graphic>
+                </wp:inline>
+              </w:drawing>
+            </w:r>
+            <w:r>
+              <w:rPr>
+                <w:rFonts w:eastAsiaTheme="minorEastAsia"/>
+                <w:color w:val="auto"/>
+                <w:sz w:val="18"/>
+                <w:lang w:val="en-US" w:eastAsia="ja-JP" w:bidi="fr-FR"/>
+              </w:rPr>
+              <w:t>Vue.js</w:t>
+            </w:r>
+            <w:r>
+              <w:rPr>
+                <w:rFonts w:eastAsiaTheme="minorEastAsia"/>
+                <w:color w:val="auto"/>
+                <w:sz w:val="18"/>
+                <w:lang w:val="en-US" w:eastAsia="ja-JP" w:bidi="fr-FR"/>
+              </w:rPr>
+              <w:t xml:space="preserve"> </w:t>
+            </w:r>
+            <w:r>
+              <w:rPr>
+                <w:rFonts w:eastAsiaTheme="minorEastAsia"/>
+                <w:color w:val="auto"/>
+                <w:sz w:val="18"/>
+                <w:lang w:val="en-US" w:eastAsia="ja-JP" w:bidi="fr-FR"/>
+              </w:rPr>
+              <w:t xml:space="preserve">                                  </w:t>
+            </w:r>
+            <w:r>
+              <w:rPr>
+                <w:rFonts w:eastAsiaTheme="minorEastAsia"/>
+                <w:color w:val="auto"/>
+                <w:sz w:val="18"/>
+                <w:lang w:val="en-US" w:eastAsia="ja-JP" w:bidi="fr-FR"/>
+              </w:rPr>
+              <w:t xml:space="preserve">   </w:t>
+            </w:r>
+            <w:r>
+              <w:rPr>
+                <w:rStyle w:val="lev"/>
+                <w:bCs w:val="0"/>
+                <w:caps/>
+                <w:noProof/>
+              </w:rPr>
+              <w:drawing>
+                <wp:inline distT="0" distB="0" distL="0" distR="0" wp14:anchorId="409ED2B6" wp14:editId="76CDA9D5">
+                  <wp:extent cx="228600" cy="228600"/>
+                  <wp:effectExtent l="0" t="0" r="0" b="0"/>
+                  <wp:docPr id="17" name="Graphique 17"/>
+                  <wp:cNvGraphicFramePr>
+                    <a:graphicFrameLocks xmlns:a="http://schemas.openxmlformats.org/drawingml/2006/main" noChangeAspect="1"/>
+                  </wp:cNvGraphicFramePr>
+                  <a:graphic xmlns:a="http://schemas.openxmlformats.org/drawingml/2006/main">
+                    <a:graphicData uri="http://schemas.openxmlformats.org/drawingml/2006/picture">
+                      <pic:pic xmlns:pic="http://schemas.openxmlformats.org/drawingml/2006/picture">
+                        <pic:nvPicPr>
+                          <pic:cNvPr id="1" name=""/>
+                          <pic:cNvPicPr/>
+                        </pic:nvPicPr>
+                        <pic:blipFill>
+                          <a:blip r:embed="rId32">
+                            <a:extLst>
+                              <a:ext uri="{96DAC541-7B7A-43D3-8B79-37D633B846F1}">
+                                <asvg:svgBlip xmlns:asvg="http://schemas.microsoft.com/office/drawing/2016/SVG/main" r:embed="rId33"/>
+                              </a:ext>
+                            </a:extLst>
+                          </a:blip>
+                          <a:stretch>
+                            <a:fillRect/>
+                          </a:stretch>
+                        </pic:blipFill>
+                        <pic:spPr>
+                          <a:xfrm>
+                            <a:off x="0" y="0"/>
+                            <a:ext cx="228600" cy="228600"/>
+                          </a:xfrm>
+                          <a:prstGeom prst="rect">
+                            <a:avLst/>
+                          </a:prstGeom>
+                        </pic:spPr>
+                      </pic:pic>
+                    </a:graphicData>
+                  </a:graphic>
+                </wp:inline>
+              </w:drawing>
+            </w:r>
+            <w:r>
+              <w:rPr>
+                <w:rFonts w:eastAsiaTheme="minorEastAsia"/>
+                <w:color w:val="auto"/>
+                <w:sz w:val="18"/>
+                <w:lang w:val="en-US" w:eastAsia="ja-JP" w:bidi="fr-FR"/>
+              </w:rPr>
+              <w:t>MongoDB</w:t>
+            </w:r>
+          </w:p>
+          <w:p>
+            <w:pPr>
+              <w:pStyle w:val="Listepuces"/>
+              <w:numPr>
+                <w:ilvl w:val="0"/>
+                <w:numId w:val="0"/>
+              </w:numPr>
+              <w:ind w:left="420" w:hanging="360"/>
+              <w:rPr>
+                <w:rFonts w:eastAsiaTheme="minorEastAsia"/>
+                <w:color w:val="auto"/>
+                <w:sz w:val="18"/>
+                <w:lang w:val="en-US" w:eastAsia="ja-JP" w:bidi="fr-FR"/>
+              </w:rPr>
+            </w:pPr>
+            <w:r>
+              <w:rPr>
+                <w:rFonts w:eastAsiaTheme="minorEastAsia"/>
+                <w:color w:val="auto"/>
+                <w:sz w:val="18"/>
+                <w:lang w:val="en-US" w:eastAsia="ja-JP" w:bidi="fr-FR"/>
+              </w:rPr>
+              <w:t xml:space="preserve">                         </w:t>
+            </w:r>
+            <w:r>
+              <w:rPr>
+                <w:rFonts w:eastAsiaTheme="minorEastAsia"/>
+                <w:color w:val="auto"/>
+                <w:sz w:val="18"/>
+                <w:lang w:val="en-US" w:eastAsia="ja-JP" w:bidi="fr-FR"/>
+              </w:rPr>
+              <w:drawing>
+                <wp:inline distT="0" distB="0" distL="0" distR="0" wp14:anchorId="4FA84E50" wp14:editId="1DFAD253">
+                  <wp:extent cx="228600" cy="228600"/>
+                  <wp:effectExtent l="0" t="0" r="0" b="0"/>
+                  <wp:docPr id="12" name="Graphique 12"/>
+                  <wp:cNvGraphicFramePr>
+                    <a:graphicFrameLocks xmlns:a="http://schemas.openxmlformats.org/drawingml/2006/main" noChangeAspect="1"/>
+                  </wp:cNvGraphicFramePr>
+                  <a:graphic xmlns:a="http://schemas.openxmlformats.org/drawingml/2006/main">
+                    <a:graphicData uri="http://schemas.openxmlformats.org/drawingml/2006/picture">
+                      <pic:pic xmlns:pic="http://schemas.openxmlformats.org/drawingml/2006/picture">
+                        <pic:nvPicPr>
+                          <pic:cNvPr id="1" name=""/>
+                          <pic:cNvPicPr/>
+                        </pic:nvPicPr>
+                        <pic:blipFill>
+                          <a:blip r:embed="rId34">
+                            <a:extLst>
+                              <a:ext uri="{96DAC541-7B7A-43D3-8B79-37D633B846F1}">
+                                <asvg:svgBlip xmlns:asvg="http://schemas.microsoft.com/office/drawing/2016/SVG/main" r:embed="rId35"/>
+                              </a:ext>
+                            </a:extLst>
+                          </a:blip>
+                          <a:stretch>
+                            <a:fillRect/>
+                          </a:stretch>
+                        </pic:blipFill>
+                        <pic:spPr>
+                          <a:xfrm>
+                            <a:off x="0" y="0"/>
+                            <a:ext cx="228600" cy="228600"/>
+                          </a:xfrm>
+                          <a:prstGeom prst="rect">
+                            <a:avLst/>
+                          </a:prstGeom>
+                        </pic:spPr>
+                      </pic:pic>
+                    </a:graphicData>
+                  </a:graphic>
+                </wp:inline>
+              </w:drawing>
+            </w:r>
+            <w:r>
+              <w:rPr>
+                <w:rFonts w:eastAsiaTheme="minorEastAsia"/>
+                <w:color w:val="auto"/>
+                <w:sz w:val="18"/>
+                <w:lang w:val="en-US" w:eastAsia="ja-JP" w:bidi="fr-FR"/>
+              </w:rPr>
+              <w:t>Typescript</w:t>
+            </w:r>
+            <w:r>
+              <w:rPr>
+                <w:rFonts w:eastAsiaTheme="minorEastAsia"/>
+                <w:color w:val="auto"/>
+                <w:sz w:val="18"/>
+                <w:lang w:val="en-US" w:eastAsia="ja-JP" w:bidi="fr-FR"/>
+              </w:rPr>
+              <w:t xml:space="preserve">                     </w:t>
+            </w:r>
+            <w:r>
+              <w:rPr>
+                <w:rFonts w:eastAsiaTheme="minorEastAsia"/>
+                <w:color w:val="auto"/>
+                <w:sz w:val="18"/>
+                <w:lang w:val="en-US" w:eastAsia="ja-JP" w:bidi="fr-FR"/>
+              </w:rPr>
+              <w:t xml:space="preserve">        </w:t>
+            </w:r>
+            <w:r>
+              <w:rPr>
+                <w:rFonts w:eastAsiaTheme="minorEastAsia"/>
+                <w:color w:val="auto"/>
+                <w:sz w:val="18"/>
+                <w:lang w:val="en-US" w:eastAsia="ja-JP" w:bidi="fr-FR"/>
+              </w:rPr>
+              <w:t xml:space="preserve"> </w:t>
+            </w:r>
+            <w:r>
+              <w:rPr>
+                <w:rFonts w:eastAsiaTheme="minorEastAsia"/>
+                <w:color w:val="auto"/>
+                <w:sz w:val="18"/>
+                <w:lang w:val="en-US" w:eastAsia="ja-JP" w:bidi="fr-FR"/>
+              </w:rPr>
+              <w:t xml:space="preserve"> </w:t>
+            </w:r>
+            <w:r>
+              <w:rPr>
+                <w:rFonts w:eastAsiaTheme="minorEastAsia"/>
+                <w:color w:val="auto"/>
+                <w:sz w:val="18"/>
+                <w:lang w:val="en-US" w:eastAsia="ja-JP" w:bidi="fr-FR"/>
+              </w:rPr>
+              <w:drawing>
+                <wp:inline distT="0" distB="0" distL="0" distR="0" wp14:anchorId="5A48435A" wp14:editId="3B41B555">
+                  <wp:extent cx="228600" cy="228600"/>
+                  <wp:effectExtent l="0" t="0" r="0" b="0"/>
+                  <wp:docPr id="20" name="Graphique 20"/>
+                  <wp:cNvGraphicFramePr>
+                    <a:graphicFrameLocks xmlns:a="http://schemas.openxmlformats.org/drawingml/2006/main" noChangeAspect="1"/>
+                  </wp:cNvGraphicFramePr>
+                  <a:graphic xmlns:a="http://schemas.openxmlformats.org/drawingml/2006/main">
+                    <a:graphicData uri="http://schemas.openxmlformats.org/drawingml/2006/picture">
+                      <pic:pic xmlns:pic="http://schemas.openxmlformats.org/drawingml/2006/picture">
+                        <pic:nvPicPr>
+                          <pic:cNvPr id="1" name=""/>
+                          <pic:cNvPicPr/>
+                        </pic:nvPicPr>
+                        <pic:blipFill>
+                          <a:blip r:embed="rId36">
+                            <a:extLst>
+                              <a:ext uri="{96DAC541-7B7A-43D3-8B79-37D633B846F1}">
+                                <asvg:svgBlip xmlns:asvg="http://schemas.microsoft.com/office/drawing/2016/SVG/main" r:embed="rId37"/>
+                              </a:ext>
+                            </a:extLst>
+                          </a:blip>
+                          <a:stretch>
+                            <a:fillRect/>
+                          </a:stretch>
+                        </pic:blipFill>
+                        <pic:spPr>
+                          <a:xfrm>
+                            <a:off x="0" y="0"/>
+                            <a:ext cx="228600" cy="228600"/>
+                          </a:xfrm>
+                          <a:prstGeom prst="rect">
+                            <a:avLst/>
+                          </a:prstGeom>
+                        </pic:spPr>
+                      </pic:pic>
+                    </a:graphicData>
+                  </a:graphic>
+                </wp:inline>
+              </w:drawing>
+            </w:r>
+            <w:r>
+              <w:rPr>
+                <w:rFonts w:eastAsiaTheme="minorEastAsia"/>
+                <w:color w:val="auto"/>
+                <w:sz w:val="18"/>
+                <w:lang w:val="en-US" w:eastAsia="ja-JP" w:bidi="fr-FR"/>
+              </w:rPr>
+              <w:t>MySQL</w:t>
+            </w:r>
+          </w:p>
+          <w:p>
+            <w:pPr>
+              <w:pStyle w:val="Listepuces"/>
+              <w:numPr>
+                <w:ilvl w:val="0"/>
+                <w:numId w:val="0"/>
+              </w:numPr>
+              <w:ind w:left="420" w:hanging="360"/>
+              <w:rPr>
+                <w:b/>
+                <w:bCs/>
                 <w:sz w:val="18"/>
                 <w:szCs w:val="18"/>
-                <w:lang w:val="en-US"/>
+                <w:lang w:val="en-US" w:bidi="fr-FR"/>
               </w:rPr>
             </w:pPr>
+            <w:r>
+              <w:rPr>
+                <w:rFonts w:eastAsiaTheme="minorEastAsia"/>
+                <w:color w:val="auto"/>
+                <w:sz w:val="18"/>
+                <w:lang w:val="en-US" w:eastAsia="ja-JP" w:bidi="fr-FR"/>
+              </w:rPr>
+              <w:t xml:space="preserve">                         </w:t>
+            </w:r>
+            <w:r>
+              <w:rPr>
+                <w:b/>
+                <w:bCs/>
+                <w:sz w:val="18"/>
+                <w:szCs w:val="18"/>
+                <w:lang w:bidi="fr-FR"/>
+              </w:rPr>
+              <w:drawing>
+                <wp:inline distT="0" distB="0" distL="0" distR="0" wp14:anchorId="3E99BFCD" wp14:editId="36854201">
+                  <wp:extent cx="228600" cy="228600"/>
+                  <wp:effectExtent l="0" t="0" r="0" b="0"/>
+                  <wp:docPr id="13" name="Graphique 13"/>
+                  <wp:cNvGraphicFramePr>
+                    <a:graphicFrameLocks xmlns:a="http://schemas.openxmlformats.org/drawingml/2006/main" noChangeAspect="1"/>
+                  </wp:cNvGraphicFramePr>
+                  <a:graphic xmlns:a="http://schemas.openxmlformats.org/drawingml/2006/main">
+                    <a:graphicData uri="http://schemas.openxmlformats.org/drawingml/2006/picture">
+                      <pic:pic xmlns:pic="http://schemas.openxmlformats.org/drawingml/2006/picture">
+                        <pic:nvPicPr>
+                          <pic:cNvPr id="1" name=""/>
+                          <pic:cNvPicPr/>
+                        </pic:nvPicPr>
+                        <pic:blipFill>
+                          <a:blip r:embed="rId38">
+                            <a:extLst>
+                              <a:ext uri="{96DAC541-7B7A-43D3-8B79-37D633B846F1}">
+                                <asvg:svgBlip xmlns:asvg="http://schemas.microsoft.com/office/drawing/2016/SVG/main" r:embed="rId39"/>
+                              </a:ext>
+                            </a:extLst>
+                          </a:blip>
+                          <a:stretch>
+                            <a:fillRect/>
+                          </a:stretch>
+                        </pic:blipFill>
+                        <pic:spPr>
+                          <a:xfrm>
+                            <a:off x="0" y="0"/>
+                            <a:ext cx="228600" cy="228600"/>
+                          </a:xfrm>
+                          <a:prstGeom prst="rect">
+                            <a:avLst/>
+                          </a:prstGeom>
+                        </pic:spPr>
+                      </pic:pic>
+                    </a:graphicData>
+                  </a:graphic>
+                </wp:inline>
+              </w:drawing>
+            </w:r>
+            <w:r>
+              <w:rPr>
+                <w:rFonts w:eastAsiaTheme="minorEastAsia"/>
+                <w:color w:val="auto"/>
+                <w:sz w:val="18"/>
+                <w:lang w:val="en-US" w:eastAsia="ja-JP" w:bidi="fr-FR"/>
+              </w:rPr>
+              <w:t>Vite</w:t>
+            </w:r>
+            <w:r>
+              <w:rPr>
+                <w:rFonts w:eastAsiaTheme="minorEastAsia"/>
+                <w:color w:val="auto"/>
+                <w:sz w:val="18"/>
+                <w:lang w:val="en-US" w:eastAsia="ja-JP" w:bidi="fr-FR"/>
+              </w:rPr>
+              <w:t xml:space="preserve">                                                </w:t>
+            </w:r>
           </w:p>
           <w:p>
             <w:pPr>
@@ -1583,62 +2736,6 @@
               </w:rPr>
               <w:t xml:space="preserve"> des charges</w:t>
             </w:r>
-          </w:p>
-          <w:p>
-            <w:pPr>
-              <w:pStyle w:val="Listepuces"/>
-              <w:numPr>
-                <w:ilvl w:val="0"/>
-                <w:numId w:val="0"/>
-              </w:numPr>
-              <w:ind w:left="420" w:hanging="360"/>
-              <w:jc w:val="both"/>
-              <w:rPr>
-                <w:color w:val="000000" w:themeColor="text1"/>
-              </w:rPr>
-            </w:pPr>
-          </w:p>
-          <w:p>
-            <w:pPr>
-              <w:pStyle w:val="Listepuces"/>
-              <w:numPr>
-                <w:ilvl w:val="0"/>
-                <w:numId w:val="0"/>
-              </w:numPr>
-              <w:ind w:left="420" w:hanging="360"/>
-              <w:jc w:val="both"/>
-              <w:rPr>
-                <w:color w:val="000000" w:themeColor="text1"/>
-              </w:rPr>
-            </w:pPr>
-          </w:p>
-          <w:p>
-            <w:pPr>
-              <w:pStyle w:val="Listepuces"/>
-              <w:numPr>
-                <w:ilvl w:val="0"/>
-                <w:numId w:val="0"/>
-              </w:numPr>
-              <w:ind w:left="420" w:hanging="360"/>
-              <w:jc w:val="both"/>
-              <w:rPr>
-                <w:color w:val="000000" w:themeColor="text1"/>
-              </w:rPr>
-            </w:pPr>
-          </w:p>
-          <w:p>
-            <w:pPr>
-              <w:pStyle w:val="Listepuces"/>
-              <w:numPr>
-                <w:ilvl w:val="0"/>
-                <w:numId w:val="0"/>
-              </w:numPr>
-              <w:ind w:left="420"/>
-              <w:jc w:val="both"/>
-              <w:rPr>
-                <w:color w:val="FFFFFF" w:themeColor="background1"/>
-              </w:rPr>
-            </w:pPr>
           </w:p>
         </w:tc>
       </w:tr>
@@ -1656,34 +2753,8 @@
         </w:rPr>
       </w:pPr>
     </w:p>
-    <w:p>
-      <w:pPr>
-        <w:tabs>
-          <w:tab w:val="left" w:pos="990"/>
-        </w:tabs>
-        <w:rPr>
-          <w:rStyle w:val="lev"/>
-          <w:bCs w:val="0"/>
-          <w:caps/>
-          <w:noProof/>
-        </w:rPr>
-      </w:pPr>
-    </w:p>
-    <w:p>
-      <w:pPr>
-        <w:tabs>
-          <w:tab w:val="left" w:pos="990"/>
-        </w:tabs>
-        <w:rPr>
-          <w:rStyle w:val="lev"/>
-          <w:bCs w:val="0"/>
-          <w:caps/>
-          <w:noProof/>
-        </w:rPr>
-      </w:pPr>
-    </w:p>
     <w:sectPr>
-      <w:headerReference w:type="default" r:id="rId14"/>
+      <w:headerReference w:type="default" r:id="rId40"/>
       <w:pgSz w:w="11906" w:h="16838" w:code="9"/>
       <w:pgMar w:top="567" w:right="544" w:bottom="567" w:left="544" w:header="720" w:footer="720" w:gutter="0"/>
       <w:cols w:space="720"/>
@@ -2458,6 +3529,92 @@
     </w:lvl>
   </w:abstractNum>
   <w:abstractNum w:abstractNumId="5" w15:restartNumberingAfterBreak="0">
+    <w:nsid w:val="58655A00"/>
+    <w:multiLevelType w:val="hybridMultilevel"/>
+    <w:tmpl w:val="F5CADB5A"/>
+    <w:lvl w:ilvl="0" w:tplc="040C000F">
+      <w:start w:val="1"/>
+      <w:numFmt w:val="decimal"/>
+      <w:lvlText w:val="%1."/>
+      <w:lvlJc w:val="left"/>
+      <w:pPr>
+        <w:ind w:left="1140" w:hanging="360"/>
+      </w:pPr>
+    </w:lvl>
+    <w:lvl w:ilvl="1" w:tplc="040C0019" w:tentative="1">
+      <w:start w:val="1"/>
+      <w:numFmt w:val="lowerLetter"/>
+      <w:lvlText w:val="%2."/>
+      <w:lvlJc w:val="left"/>
+      <w:pPr>
+        <w:ind w:left="1860" w:hanging="360"/>
+      </w:pPr>
+    </w:lvl>
+    <w:lvl w:ilvl="2" w:tplc="040C001B" w:tentative="1">
+      <w:start w:val="1"/>
+      <w:numFmt w:val="lowerRoman"/>
+      <w:lvlText w:val="%3."/>
+      <w:lvlJc w:val="right"/>
+      <w:pPr>
+        <w:ind w:left="2580" w:hanging="180"/>
+      </w:pPr>
+    </w:lvl>
+    <w:lvl w:ilvl="3" w:tplc="040C000F" w:tentative="1">
+      <w:start w:val="1"/>
+      <w:numFmt w:val="decimal"/>
+      <w:lvlText w:val="%4."/>
+      <w:lvlJc w:val="left"/>
+      <w:pPr>
+        <w:ind w:left="3300" w:hanging="360"/>
+      </w:pPr>
+    </w:lvl>
+    <w:lvl w:ilvl="4" w:tplc="040C0019" w:tentative="1">
+      <w:start w:val="1"/>
+      <w:numFmt w:val="lowerLetter"/>
+      <w:lvlText w:val="%5."/>
+      <w:lvlJc w:val="left"/>
+      <w:pPr>
+        <w:ind w:left="4020" w:hanging="360"/>
+      </w:pPr>
+    </w:lvl>
+    <w:lvl w:ilvl="5" w:tplc="040C001B" w:tentative="1">
+      <w:start w:val="1"/>
+      <w:numFmt w:val="lowerRoman"/>
+      <w:lvlText w:val="%6."/>
+      <w:lvlJc w:val="right"/>
+      <w:pPr>
+        <w:ind w:left="4740" w:hanging="180"/>
+      </w:pPr>
+    </w:lvl>
+    <w:lvl w:ilvl="6" w:tplc="040C000F" w:tentative="1">
+      <w:start w:val="1"/>
+      <w:numFmt w:val="decimal"/>
+      <w:lvlText w:val="%7."/>
+      <w:lvlJc w:val="left"/>
+      <w:pPr>
+        <w:ind w:left="5460" w:hanging="360"/>
+      </w:pPr>
+    </w:lvl>
+    <w:lvl w:ilvl="7" w:tplc="040C0019" w:tentative="1">
+      <w:start w:val="1"/>
+      <w:numFmt w:val="lowerLetter"/>
+      <w:lvlText w:val="%8."/>
+      <w:lvlJc w:val="left"/>
+      <w:pPr>
+        <w:ind w:left="6180" w:hanging="360"/>
+      </w:pPr>
+    </w:lvl>
+    <w:lvl w:ilvl="8" w:tplc="040C001B" w:tentative="1">
+      <w:start w:val="1"/>
+      <w:numFmt w:val="lowerRoman"/>
+      <w:lvlText w:val="%9."/>
+      <w:lvlJc w:val="right"/>
+      <w:pPr>
+        <w:ind w:left="6900" w:hanging="180"/>
+      </w:pPr>
+    </w:lvl>
+  </w:abstractNum>
+  <w:abstractNum w:abstractNumId="6" w15:restartNumberingAfterBreak="0">
     <w:nsid w:val="6A20204A"/>
     <w:multiLevelType w:val="multilevel"/>
     <w:tmpl w:val="F718F2F0"/>
@@ -2606,7 +3763,7 @@
       </w:rPr>
     </w:lvl>
   </w:abstractNum>
-  <w:abstractNum w:abstractNumId="6" w15:restartNumberingAfterBreak="0">
+  <w:abstractNum w:abstractNumId="7" w15:restartNumberingAfterBreak="0">
     <w:nsid w:val="71DD6DD9"/>
     <w:multiLevelType w:val="hybridMultilevel"/>
     <w:tmpl w:val="DF5EDBA6"/>
@@ -2692,7 +3849,7 @@
       </w:pPr>
     </w:lvl>
   </w:abstractNum>
-  <w:abstractNum w:abstractNumId="7" w15:restartNumberingAfterBreak="0">
+  <w:abstractNum w:abstractNumId="8" w15:restartNumberingAfterBreak="0">
     <w:nsid w:val="76740742"/>
     <w:multiLevelType w:val="multilevel"/>
     <w:tmpl w:val="20FCEF7E"/>
@@ -2845,7 +4002,7 @@
     <w:abstractNumId w:val="2"/>
   </w:num>
   <w:num w:numId="2" w16cid:durableId="2041514187">
-    <w:abstractNumId w:val="6"/>
+    <w:abstractNumId w:val="7"/>
   </w:num>
   <w:num w:numId="3" w16cid:durableId="714692618">
     <w:abstractNumId w:val="3"/>
@@ -2854,16 +4011,19 @@
     <w:abstractNumId w:val="0"/>
   </w:num>
   <w:num w:numId="5" w16cid:durableId="729810935">
-    <w:abstractNumId w:val="7"/>
+    <w:abstractNumId w:val="8"/>
   </w:num>
   <w:num w:numId="6" w16cid:durableId="1991253800">
     <w:abstractNumId w:val="4"/>
   </w:num>
   <w:num w:numId="7" w16cid:durableId="819617382">
-    <w:abstractNumId w:val="5"/>
+    <w:abstractNumId w:val="6"/>
   </w:num>
   <w:num w:numId="8" w16cid:durableId="693730962">
     <w:abstractNumId w:val="1"/>
+  </w:num>
+  <w:num w:numId="9" w16cid:durableId="743649288">
+    <w:abstractNumId w:val="5"/>
   </w:num>
 </w:numbering>
 </file>
@@ -3355,6 +4515,7 @@
   <w:style w:type="character" w:default="1" w:styleId="Policepardfaut">
     <w:name w:val="Default Paragraph Font"/>
     <w:uiPriority w:val="1"/>
+    <w:semiHidden/>
     <w:unhideWhenUsed/>
   </w:style>
   <w:style w:type="table" w:default="1" w:styleId="TableauNormal">
@@ -3910,9 +5071,13 @@
     <w:rsid w:val="000A7359"/>
     <w:rsid w:val="001C7C98"/>
     <w:rsid w:val="00331E9F"/>
+    <w:rsid w:val="00554F99"/>
     <w:rsid w:val="00561068"/>
     <w:rsid w:val="00683A89"/>
+    <w:rsid w:val="007F7039"/>
+    <w:rsid w:val="00A12EF6"/>
     <w:rsid w:val="00B95798"/>
+    <w:rsid w:val="00C773D6"/>
     <w:rsid w:val="00CF69CA"/>
     <w:rsid w:val="00D66935"/>
     <w:rsid w:val="00F33294"/>

</xml_diff>

<commit_message>
Mise à jour du lien du projet CMA GYM vers une nouvelle URL pour un accès amélioré.
</commit_message>
<xml_diff>
--- a/assets/docs/cv cad.docx
+++ b/assets/docs/cv cad.docx
@@ -307,24 +307,41 @@
                 <w:szCs w:val="16"/>
                 <w:lang w:bidi="fr-FR"/>
               </w:rPr>
-              <w:t xml:space="preserve"> Région Île-de-France (ou télétravail)</w:t>
-            </w:r>
-          </w:p>
-          <w:p>
-            <w:pPr>
+              <w:t xml:space="preserve"> Région Île-de-France (ou </w:t>
+            </w:r>
+            <w:proofErr w:type="gramStart"/>
+            <w:r>
+              <w:rPr>
+                <w:sz w:val="16"/>
+                <w:szCs w:val="16"/>
+                <w:lang w:bidi="fr-FR"/>
+              </w:rPr>
+              <w:t>télétravail)</w:t>
+            </w:r>
+            <w:r>
               <w:rPr>
                 <w:sz w:val="28"/>
                 <w:szCs w:val="28"/>
                 <w:lang w:bidi="fr-FR"/>
               </w:rPr>
-            </w:pPr>
+              <w:t xml:space="preserve">  </w:t>
+            </w:r>
             <w:r>
               <w:rPr>
                 <w:sz w:val="28"/>
                 <w:szCs w:val="28"/>
                 <w:lang w:bidi="fr-FR"/>
               </w:rPr>
-              <w:t xml:space="preserve">                                                                                                             </w:t>
+              <w:t xml:space="preserve"> </w:t>
+            </w:r>
+            <w:proofErr w:type="gramEnd"/>
+            <w:r>
+              <w:rPr>
+                <w:sz w:val="28"/>
+                <w:szCs w:val="28"/>
+                <w:lang w:bidi="fr-FR"/>
+              </w:rPr>
+              <w:t xml:space="preserve">                                                                                    </w:t>
             </w:r>
           </w:p>
         </w:tc>
@@ -337,11 +354,6 @@
           <w:tcPr>
             <w:tcW w:w="3704" w:type="dxa"/>
           </w:tcPr>
-          <w:p>
-            <w:pPr>
-              <w:pStyle w:val="Titre3"/>
-            </w:pPr>
-          </w:p>
           <w:p>
             <w:pPr>
               <w:pStyle w:val="Titre3"/>
@@ -413,6 +425,184 @@
             </w:r>
           </w:p>
           <w:p/>
+          <w:p>
+            <w:pPr>
+              <w:pStyle w:val="Titre3"/>
+              <w:rPr>
+                <w:lang w:bidi="fr-FR"/>
+              </w:rPr>
+            </w:pPr>
+            <w:r>
+              <w:rPr>
+                <w:lang w:bidi="fr-FR"/>
+              </w:rPr>
+              <w:t>diplômes</w:t>
+            </w:r>
+          </w:p>
+          <w:p>
+            <w:pPr>
+              <w:rPr>
+                <w:b/>
+                <w:bCs/>
+                <w:lang w:bidi="fr-FR"/>
+              </w:rPr>
+            </w:pPr>
+            <w:r>
+              <w:rPr>
+                <w:b/>
+                <w:bCs/>
+                <w:lang w:bidi="fr-FR"/>
+              </w:rPr>
+              <w:t xml:space="preserve">Développeur Web &amp; Web Mobile </w:t>
+            </w:r>
+          </w:p>
+          <w:p>
+            <w:pPr>
+              <w:rPr>
+                <w:lang w:bidi="fr-FR"/>
+              </w:rPr>
+            </w:pPr>
+            <w:r>
+              <w:rPr>
+                <w:lang w:bidi="fr-FR"/>
+              </w:rPr>
+              <w:t xml:space="preserve">     </w:t>
+            </w:r>
+            <w:r>
+              <w:rPr>
+                <w:lang w:bidi="fr-FR"/>
+              </w:rPr>
+              <w:t>Titre Pro Niveau 5</w:t>
+            </w:r>
+          </w:p>
+          <w:p>
+            <w:pPr>
+              <w:rPr>
+                <w:lang w:bidi="fr-FR"/>
+              </w:rPr>
+            </w:pPr>
+          </w:p>
+          <w:p>
+            <w:pPr>
+              <w:rPr>
+                <w:b/>
+                <w:bCs/>
+                <w:lang w:bidi="fr-FR"/>
+              </w:rPr>
+            </w:pPr>
+            <w:r>
+              <w:rPr>
+                <w:b/>
+                <w:bCs/>
+                <w:lang w:bidi="fr-FR"/>
+              </w:rPr>
+              <w:t>Développeur web junior</w:t>
+            </w:r>
+            <w:r>
+              <w:rPr>
+                <w:b/>
+                <w:bCs/>
+                <w:lang w:bidi="fr-FR"/>
+              </w:rPr>
+              <w:t xml:space="preserve"> 2023</w:t>
+            </w:r>
+          </w:p>
+          <w:p>
+            <w:pPr>
+              <w:rPr>
+                <w:b/>
+                <w:bCs/>
+                <w:lang w:bidi="fr-FR"/>
+              </w:rPr>
+            </w:pPr>
+          </w:p>
+          <w:p>
+            <w:pPr>
+              <w:rPr>
+                <w:lang w:bidi="fr-FR"/>
+              </w:rPr>
+            </w:pPr>
+            <w:proofErr w:type="spellStart"/>
+            <w:r>
+              <w:rPr>
+                <w:b/>
+                <w:bCs/>
+                <w:lang w:bidi="fr-FR"/>
+              </w:rPr>
+              <w:t>Cqp</w:t>
+            </w:r>
+            <w:proofErr w:type="spellEnd"/>
+            <w:r>
+              <w:rPr>
+                <w:b/>
+                <w:bCs/>
+                <w:lang w:bidi="fr-FR"/>
+              </w:rPr>
+              <w:t xml:space="preserve"> </w:t>
+            </w:r>
+            <w:proofErr w:type="spellStart"/>
+            <w:r>
+              <w:rPr>
+                <w:b/>
+                <w:bCs/>
+                <w:lang w:bidi="fr-FR"/>
+              </w:rPr>
+              <w:t>aps</w:t>
+            </w:r>
+            <w:proofErr w:type="spellEnd"/>
+            <w:r>
+              <w:rPr>
+                <w:b/>
+                <w:bCs/>
+                <w:lang w:bidi="fr-FR"/>
+              </w:rPr>
+              <w:t xml:space="preserve"> agent de sécurité</w:t>
+            </w:r>
+            <w:r>
+              <w:rPr>
+                <w:lang w:bidi="fr-FR"/>
+              </w:rPr>
+              <w:t xml:space="preserve"> sep2012</w:t>
+            </w:r>
+          </w:p>
+          <w:p>
+            <w:pPr>
+              <w:rPr>
+                <w:lang w:bidi="fr-FR"/>
+              </w:rPr>
+            </w:pPr>
+          </w:p>
+          <w:p>
+            <w:pPr>
+              <w:rPr>
+                <w:lang w:bidi="fr-FR"/>
+              </w:rPr>
+            </w:pPr>
+            <w:proofErr w:type="spellStart"/>
+            <w:r>
+              <w:rPr>
+                <w:b/>
+                <w:bCs/>
+                <w:lang w:bidi="fr-FR"/>
+              </w:rPr>
+              <w:t>Caces</w:t>
+            </w:r>
+            <w:proofErr w:type="spellEnd"/>
+            <w:r>
+              <w:rPr>
+                <w:b/>
+                <w:bCs/>
+                <w:lang w:bidi="fr-FR"/>
+              </w:rPr>
+              <w:t xml:space="preserve"> 1.3.5</w:t>
+            </w:r>
+            <w:r>
+              <w:rPr>
+                <w:lang w:bidi="fr-FR"/>
+              </w:rPr>
+              <w:t xml:space="preserve"> juillet 2019</w:t>
+            </w:r>
+          </w:p>
           <w:p/>
           <w:p/>
           <w:p>
@@ -632,26 +822,6 @@
           </w:p>
           <w:p>
             <w:pPr>
-              <w:rPr>
-                <w:rStyle w:val="Lienhypertexte"/>
-                <w:color w:val="auto"/>
-                <w:u w:val="none"/>
-                <w:lang w:bidi="fr-FR"/>
-              </w:rPr>
-            </w:pPr>
-          </w:p>
-          <w:p>
-            <w:pPr>
-              <w:rPr>
-                <w:rStyle w:val="Lienhypertexte"/>
-                <w:color w:val="auto"/>
-                <w:u w:val="none"/>
-                <w:lang w:bidi="fr-FR"/>
-              </w:rPr>
-            </w:pPr>
-          </w:p>
-          <w:p>
-            <w:pPr>
               <w:pStyle w:val="Titre3"/>
               <w:rPr>
                 <w:lang w:bidi="fr-FR"/>
@@ -688,24 +858,25 @@
                 <w:lang w:val="en-US"/>
               </w:rPr>
             </w:pPr>
+            <w:proofErr w:type="gramStart"/>
             <w:r>
               <w:rPr>
                 <w:lang w:val="en-US"/>
               </w:rPr>
-              <w:t>Sports : basket, foot, UFC</w:t>
+              <w:t>Sports :</w:t>
+            </w:r>
+            <w:proofErr w:type="gramEnd"/>
+            <w:r>
+              <w:rPr>
+                <w:lang w:val="en-US"/>
+              </w:rPr>
+              <w:t xml:space="preserve"> basket, foot, UFC</w:t>
             </w:r>
           </w:p>
           <w:p>
             <w:r>
               <w:t>Histoire &amp; documentaires</w:t>
             </w:r>
-          </w:p>
-          <w:p>
-            <w:pPr>
-              <w:rPr>
-                <w:lang w:bidi="fr-FR"/>
-              </w:rPr>
-            </w:pPr>
           </w:p>
           <w:p>
             <w:pPr>
@@ -807,38 +978,61 @@
           <w:p>
             <w:pPr>
               <w:rPr>
-                <w:lang w:bidi="fr-FR"/>
-              </w:rPr>
-            </w:pPr>
-            <w:r>
-              <w:rPr>
                 <w:b/>
                 <w:bCs/>
                 <w:lang w:bidi="fr-FR"/>
               </w:rPr>
-              <w:t>Développeur Web Freelance (2023 – Présent)</w:t>
-            </w:r>
-            <w:r>
+            </w:pPr>
+          </w:p>
+          <w:p>
+            <w:pPr>
               <w:rPr>
                 <w:b/>
                 <w:bCs/>
                 <w:lang w:bidi="fr-FR"/>
               </w:rPr>
+            </w:pPr>
+            <w:r>
+              <w:rPr>
+                <w:b/>
+                <w:bCs/>
+                <w:lang w:bidi="fr-FR"/>
+              </w:rPr>
+              <w:t>Développeur Web Freelance (2023 – Présent)</w:t>
+            </w:r>
+            <w:r>
+              <w:rPr>
+                <w:b/>
+                <w:bCs/>
+                <w:lang w:bidi="fr-FR"/>
+              </w:rPr>
               <w:br/>
             </w:r>
             <w:r>
               <w:rPr>
                 <w:lang w:bidi="fr-FR"/>
               </w:rPr>
-              <w:t>Conception de sites vitrines pour TPE/PME</w:t>
-            </w:r>
-          </w:p>
-          <w:p>
-            <w:pPr>
-              <w:rPr>
-                <w:lang w:bidi="fr-FR"/>
-              </w:rPr>
-            </w:pPr>
+              <w:t xml:space="preserve">    </w:t>
+            </w:r>
+            <w:r>
+              <w:rPr>
+                <w:lang w:bidi="fr-FR"/>
+              </w:rPr>
+              <w:t>Conception de sites vitrines</w:t>
+            </w:r>
+          </w:p>
+          <w:p>
+            <w:pPr>
+              <w:rPr>
+                <w:lang w:bidi="fr-FR"/>
+              </w:rPr>
+            </w:pPr>
+            <w:r>
+              <w:rPr>
+                <w:lang w:bidi="fr-FR"/>
+              </w:rPr>
+              <w:t xml:space="preserve">    </w:t>
+            </w:r>
             <w:r>
               <w:rPr>
                 <w:lang w:bidi="fr-FR"/>
@@ -856,15 +1050,33 @@
               <w:rPr>
                 <w:lang w:val="en-US" w:bidi="fr-FR"/>
               </w:rPr>
-              <w:t>Stack : HTML, CSS, JS, React, Node.js</w:t>
-            </w:r>
-          </w:p>
-          <w:p>
-            <w:pPr>
-              <w:rPr>
-                <w:lang w:bidi="fr-FR"/>
-              </w:rPr>
-            </w:pPr>
+              <w:t xml:space="preserve">    </w:t>
+            </w:r>
+            <w:r>
+              <w:rPr>
+                <w:lang w:val="en-US" w:bidi="fr-FR"/>
+              </w:rPr>
+              <w:t>Stack:</w:t>
+            </w:r>
+            <w:r>
+              <w:rPr>
+                <w:lang w:val="en-US" w:bidi="fr-FR"/>
+              </w:rPr>
+              <w:t xml:space="preserve"> HTML, CSS, JS, React, Node.js</w:t>
+            </w:r>
+          </w:p>
+          <w:p>
+            <w:pPr>
+              <w:rPr>
+                <w:lang w:bidi="fr-FR"/>
+              </w:rPr>
+            </w:pPr>
+            <w:r>
+              <w:rPr>
+                <w:lang w:bidi="fr-FR"/>
+              </w:rPr>
+              <w:t xml:space="preserve">    </w:t>
+            </w:r>
             <w:r>
               <w:rPr>
                 <w:lang w:bidi="fr-FR"/>
@@ -882,8 +1094,28 @@
               <w:rPr>
                 <w:lang w:bidi="fr-FR"/>
               </w:rPr>
+              <w:t xml:space="preserve">    </w:t>
+            </w:r>
+            <w:r>
+              <w:rPr>
+                <w:lang w:bidi="fr-FR"/>
+              </w:rPr>
               <w:t>Relation client, accompagnement, évolutivité</w:t>
             </w:r>
+          </w:p>
+          <w:p>
+            <w:pPr>
+              <w:rPr>
+                <w:lang w:bidi="fr-FR"/>
+              </w:rPr>
+            </w:pPr>
+          </w:p>
+          <w:p>
+            <w:pPr>
+              <w:rPr>
+                <w:lang w:bidi="fr-FR"/>
+              </w:rPr>
+            </w:pPr>
           </w:p>
           <w:p>
             <w:pPr>
@@ -919,29 +1151,33 @@
                 <w:bCs/>
                 <w:lang w:bidi="fr-FR"/>
               </w:rPr>
-              <w:t>TNT Express France, Aulnay-sous-Bois (2020-2021)</w:t>
-            </w:r>
-          </w:p>
-          <w:p>
-            <w:pPr>
-              <w:pStyle w:val="Titre4"/>
-              <w:numPr>
-                <w:ilvl w:val="0"/>
-                <w:numId w:val="7"/>
-              </w:numPr>
+              <w:t>Monoprix (2019</w:t>
+            </w:r>
+            <w:proofErr w:type="gramStart"/>
+            <w:r>
               <w:rPr>
                 <w:b w:val="0"/>
                 <w:bCs/>
                 <w:lang w:bidi="fr-FR"/>
               </w:rPr>
-            </w:pPr>
+              <w:t xml:space="preserve">) </w:t>
+            </w:r>
             <w:r>
               <w:rPr>
                 <w:b w:val="0"/>
                 <w:bCs/>
                 <w:lang w:bidi="fr-FR"/>
               </w:rPr>
-              <w:t>Monoprix (2019) : Préparation et emballage des commandes en ligne</w:t>
+              <w:t xml:space="preserve"> --</w:t>
+            </w:r>
+            <w:proofErr w:type="gramEnd"/>
+            <w:r>
+              <w:rPr>
+                <w:b w:val="0"/>
+                <w:bCs/>
+                <w:lang w:bidi="fr-FR"/>
+              </w:rPr>
+              <w:t>TNT Express France, (2020-2021)</w:t>
             </w:r>
           </w:p>
           <w:p>
@@ -976,21 +1212,15 @@
                 <w:b w:val="0"/>
                 <w:lang w:bidi="fr-FR"/>
               </w:rPr>
-              <w:t>APIS (2016-2018) : Sureté du parc lors des expositions</w:t>
-            </w:r>
-          </w:p>
-          <w:p>
-            <w:pPr>
-              <w:pStyle w:val="Titre4"/>
-              <w:numPr>
-                <w:ilvl w:val="0"/>
-                <w:numId w:val="5"/>
-              </w:numPr>
+              <w:t xml:space="preserve">GSP (2013-2014) </w:t>
+            </w:r>
+            <w:r>
               <w:rPr>
                 <w:b w:val="0"/>
                 <w:lang w:bidi="fr-FR"/>
               </w:rPr>
-            </w:pPr>
+              <w:t xml:space="preserve">-- </w:t>
+            </w:r>
             <w:proofErr w:type="spellStart"/>
             <w:r>
               <w:rPr>
@@ -1005,27 +1235,28 @@
                 <w:b w:val="0"/>
                 <w:lang w:bidi="fr-FR"/>
               </w:rPr>
-              <w:t xml:space="preserve"> (2014-2015) : Surveillance de sites mairie de Paris</w:t>
-            </w:r>
-          </w:p>
-          <w:p>
-            <w:pPr>
-              <w:pStyle w:val="Titre4"/>
-              <w:numPr>
-                <w:ilvl w:val="0"/>
-                <w:numId w:val="5"/>
-              </w:numPr>
+              <w:t xml:space="preserve"> (2014-2015)</w:t>
+            </w:r>
+            <w:r>
               <w:rPr>
                 <w:b w:val="0"/>
                 <w:lang w:bidi="fr-FR"/>
               </w:rPr>
-            </w:pPr>
+              <w:t xml:space="preserve"> --</w:t>
+            </w:r>
             <w:r>
               <w:rPr>
                 <w:b w:val="0"/>
                 <w:lang w:bidi="fr-FR"/>
               </w:rPr>
-              <w:t>GSP (2013-2014) : Surveillance du public au Grand Palais (Paris)</w:t>
+              <w:t xml:space="preserve"> </w:t>
+            </w:r>
+            <w:r>
+              <w:rPr>
+                <w:b w:val="0"/>
+                <w:lang w:bidi="fr-FR"/>
+              </w:rPr>
+              <w:t>APIS (2016-2018)</w:t>
             </w:r>
           </w:p>
           <w:sdt>
@@ -1054,54 +1285,47 @@
           </w:sdt>
           <w:p>
             <w:pPr>
-              <w:pStyle w:val="Titre4"/>
-              <w:rPr>
-                <w:bCs/>
-                <w:lang w:bidi="fr-FR"/>
-              </w:rPr>
-            </w:pPr>
-          </w:p>
-          <w:p>
-            <w:pPr>
               <w:rPr>
                 <w:b/>
                 <w:bCs/>
                 <w:lang w:bidi="fr-FR"/>
               </w:rPr>
             </w:pPr>
-            <w:proofErr w:type="spellStart"/>
-            <w:r>
+          </w:p>
+          <w:p>
+            <w:pPr>
               <w:rPr>
                 <w:b/>
                 <w:bCs/>
                 <w:lang w:bidi="fr-FR"/>
               </w:rPr>
-              <w:t>O’clock</w:t>
-            </w:r>
-            <w:proofErr w:type="spellEnd"/>
-            <w:r>
+            </w:pPr>
+          </w:p>
+          <w:p>
+            <w:pPr>
               <w:rPr>
                 <w:b/>
                 <w:bCs/>
                 <w:lang w:bidi="fr-FR"/>
               </w:rPr>
-              <w:t xml:space="preserve"> — Titre professionnel Développeur Web &amp; Web Mobile (DWWM)</w:t>
-            </w:r>
+            </w:pPr>
+            <w:proofErr w:type="spellStart"/>
             <w:r>
               <w:rPr>
                 <w:b/>
                 <w:bCs/>
                 <w:lang w:bidi="fr-FR"/>
               </w:rPr>
-              <w:br/>
-            </w:r>
+              <w:t>O’clock</w:t>
+            </w:r>
+            <w:proofErr w:type="spellEnd"/>
             <w:r>
               <w:rPr>
                 <w:b/>
                 <w:bCs/>
                 <w:lang w:bidi="fr-FR"/>
               </w:rPr>
-              <w:t xml:space="preserve"> </w:t>
+              <w:t xml:space="preserve"> — Titre professionnel Développeur Web &amp; Web Mobile (DWWM)</w:t>
             </w:r>
             <w:r>
               <w:rPr>
@@ -1109,17 +1333,29 @@
                 <w:bCs/>
                 <w:lang w:bidi="fr-FR"/>
               </w:rPr>
-              <w:t xml:space="preserve">Septembre 2024 – Juin 2025 </w:t>
+              <w:br/>
             </w:r>
             <w:r>
               <w:rPr>
                 <w:b/>
                 <w:bCs/>
-                <w:i/>
-                <w:iCs/>
-                <w:lang w:bidi="fr-FR"/>
-              </w:rPr>
-              <w:t>(en cours)</w:t>
+                <w:lang w:bidi="fr-FR"/>
+              </w:rPr>
+              <w:t xml:space="preserve"> </w:t>
+            </w:r>
+            <w:r>
+              <w:rPr>
+                <w:b/>
+                <w:bCs/>
+                <w:lang w:bidi="fr-FR"/>
+              </w:rPr>
+              <w:t xml:space="preserve">       </w:t>
+            </w:r>
+            <w:r>
+              <w:rPr>
+                <w:lang w:bidi="fr-FR"/>
+              </w:rPr>
+              <w:t xml:space="preserve">Septembre 2024 – Juin 2025 </w:t>
             </w:r>
           </w:p>
           <w:p>
@@ -1189,6 +1425,22 @@
           </w:p>
           <w:p>
             <w:pPr>
+              <w:ind w:left="720"/>
+              <w:rPr>
+                <w:lang w:bidi="fr-FR"/>
+              </w:rPr>
+            </w:pPr>
+          </w:p>
+          <w:p>
+            <w:pPr>
+              <w:ind w:left="720"/>
+              <w:rPr>
+                <w:lang w:bidi="fr-FR"/>
+              </w:rPr>
+            </w:pPr>
+          </w:p>
+          <w:p>
+            <w:pPr>
               <w:rPr>
                 <w:b/>
                 <w:bCs/>
@@ -1233,6 +1485,12 @@
               <w:rPr>
                 <w:b/>
                 <w:bCs/>
+                <w:lang w:bidi="fr-FR"/>
+              </w:rPr>
+              <w:t xml:space="preserve">       </w:t>
+            </w:r>
+            <w:r>
+              <w:rPr>
                 <w:lang w:bidi="fr-FR"/>
               </w:rPr>
               <w:t>Octobre 2021</w:t>
@@ -1302,6 +1560,22 @@
           </w:p>
           <w:p>
             <w:pPr>
+              <w:ind w:left="720"/>
+              <w:rPr>
+                <w:lang w:bidi="fr-FR"/>
+              </w:rPr>
+            </w:pPr>
+          </w:p>
+          <w:p>
+            <w:pPr>
+              <w:ind w:left="720"/>
+              <w:rPr>
+                <w:lang w:bidi="fr-FR"/>
+              </w:rPr>
+            </w:pPr>
+          </w:p>
+          <w:p>
+            <w:pPr>
               <w:rPr>
                 <w:b/>
                 <w:bCs/>
@@ -1327,24 +1601,25 @@
             <w:r>
               <w:rPr>
                 <w:rFonts w:ascii="Segoe UI Emoji" w:hAnsi="Segoe UI Emoji" w:cs="Segoe UI Emoji"/>
-                <w:b/>
-                <w:bCs/>
                 <w:lang w:bidi="fr-FR"/>
               </w:rPr>
               <w:t xml:space="preserve"> </w:t>
             </w:r>
             <w:r>
               <w:rPr>
-                <w:b/>
-                <w:bCs/>
+                <w:rFonts w:ascii="Segoe UI Emoji" w:hAnsi="Segoe UI Emoji" w:cs="Segoe UI Emoji"/>
+                <w:lang w:bidi="fr-FR"/>
+              </w:rPr>
+              <w:t xml:space="preserve">     </w:t>
+            </w:r>
+            <w:r>
+              <w:rPr>
                 <w:lang w:bidi="fr-FR"/>
               </w:rPr>
               <w:t xml:space="preserve">Prévu pour octobre 2025 </w:t>
             </w:r>
             <w:r>
               <w:rPr>
-                <w:b/>
-                <w:bCs/>
                 <w:i/>
                 <w:iCs/>
                 <w:lang w:bidi="fr-FR"/>
@@ -1383,69 +1658,6 @@
                 <w:lang w:bidi="fr-FR"/>
               </w:rPr>
               <w:t>, me perfectionner dans la gestion d’API, la conception logicielle et l’architecture d’applications professionnelles.</w:t>
-            </w:r>
-          </w:p>
-          <w:p>
-            <w:pPr>
-              <w:pStyle w:val="Titre4"/>
-              <w:rPr>
-                <w:bCs/>
-                <w:lang w:bidi="fr-FR"/>
-              </w:rPr>
-            </w:pPr>
-            <w:r>
-              <w:rPr>
-                <w:bCs/>
-                <w:lang w:bidi="fr-FR"/>
-              </w:rPr>
-              <w:t xml:space="preserve">Autre </w:t>
-            </w:r>
-            <w:r>
-              <w:rPr>
-                <w:bCs/>
-                <w:lang w:bidi="fr-FR"/>
-              </w:rPr>
-              <w:t>Certifications professionnelles</w:t>
-            </w:r>
-          </w:p>
-          <w:p>
-            <w:pPr>
-              <w:pStyle w:val="Titre4"/>
-              <w:numPr>
-                <w:ilvl w:val="0"/>
-                <w:numId w:val="8"/>
-              </w:numPr>
-              <w:rPr>
-                <w:b w:val="0"/>
-                <w:lang w:bidi="fr-FR"/>
-              </w:rPr>
-            </w:pPr>
-            <w:r>
-              <w:rPr>
-                <w:b w:val="0"/>
-                <w:lang w:bidi="fr-FR"/>
-              </w:rPr>
-              <w:t>CACES 1.3.5 – Juillet 2019</w:t>
-            </w:r>
-          </w:p>
-          <w:p>
-            <w:pPr>
-              <w:pStyle w:val="Titre4"/>
-              <w:numPr>
-                <w:ilvl w:val="0"/>
-                <w:numId w:val="8"/>
-              </w:numPr>
-              <w:rPr>
-                <w:b w:val="0"/>
-                <w:lang w:bidi="fr-FR"/>
-              </w:rPr>
-            </w:pPr>
-            <w:r>
-              <w:rPr>
-                <w:b w:val="0"/>
-                <w:lang w:bidi="fr-FR"/>
-              </w:rPr>
-              <w:t>CQP Agent de Prévention et de Sécurité (APS) – Septembre 2012</w:t>
             </w:r>
           </w:p>
           <w:p>
@@ -5730,10 +5942,12 @@
     <w:rsidRoot w:val="00561068"/>
     <w:rsid w:val="000A7359"/>
     <w:rsid w:val="000F0018"/>
+    <w:rsid w:val="001544AA"/>
     <w:rsid w:val="001C7C98"/>
     <w:rsid w:val="001F254C"/>
     <w:rsid w:val="002B508B"/>
     <w:rsid w:val="00331E9F"/>
+    <w:rsid w:val="0039512C"/>
     <w:rsid w:val="005233F3"/>
     <w:rsid w:val="00554F99"/>
     <w:rsid w:val="00561068"/>
@@ -6484,15 +6698,6 @@
 </file>
 
 <file path=customXml/item1.xml><?xml version="1.0" encoding="utf-8"?>
-<?mso-contentType ?>
-<FormTemplates xmlns="http://schemas.microsoft.com/sharepoint/v3/contenttype/forms">
-  <Display>DocumentLibraryForm</Display>
-  <Edit>DocumentLibraryForm</Edit>
-  <New>DocumentLibraryForm</New>
-</FormTemplates>
-</file>
-
-<file path=customXml/item2.xml><?xml version="1.0" encoding="utf-8"?>
 <ct:contentTypeSchema xmlns:ct="http://schemas.microsoft.com/office/2006/metadata/contentType" xmlns:ma="http://schemas.microsoft.com/office/2006/metadata/properties/metaAttributes" ct:_="" ma:_="" ma:contentTypeName="Document" ma:contentTypeID="0x01010079F111ED35F8CC479449609E8A0923A6" ma:contentTypeVersion="12" ma:contentTypeDescription="Create a new document." ma:contentTypeScope="" ma:versionID="7e3f163ba23981de9af4e94a4fc3c170">
   <xsd:schema xmlns:xsd="http://www.w3.org/2001/XMLSchema" xmlns:xs="http://www.w3.org/2001/XMLSchema" xmlns:p="http://schemas.microsoft.com/office/2006/metadata/properties" xmlns:ns2="71af3243-3dd4-4a8d-8c0d-dd76da1f02a5" xmlns:ns3="16c05727-aa75-4e4a-9b5f-8a80a1165891" targetNamespace="http://schemas.microsoft.com/office/2006/metadata/properties" ma:root="true" ma:fieldsID="77303e74caa42b09a8f0afd286949429" ns2:_="" ns3:_="">
     <xsd:import namespace="71af3243-3dd4-4a8d-8c0d-dd76da1f02a5"/>
@@ -6713,11 +6918,16 @@
 </ct:contentTypeSchema>
 </file>
 
-<file path=customXml/item3.xml><?xml version="1.0" encoding="utf-8"?>
-<b:Sources xmlns:b="http://schemas.openxmlformats.org/officeDocument/2006/bibliography" xmlns="http://schemas.openxmlformats.org/officeDocument/2006/bibliography" SelectedStyle="\APASixthEditionOfficeOnline.xsl" StyleName="APA" Version="6"/>
+<file path=customXml/item2.xml><?xml version="1.0" encoding="utf-8"?>
+<?mso-contentType ?>
+<FormTemplates xmlns="http://schemas.microsoft.com/sharepoint/v3/contenttype/forms">
+  <Display>DocumentLibraryForm</Display>
+  <Edit>DocumentLibraryForm</Edit>
+  <New>DocumentLibraryForm</New>
+</FormTemplates>
 </file>
 
-<file path=customXml/item4.xml><?xml version="1.0" encoding="utf-8"?>
+<file path=customXml/item3.xml><?xml version="1.0" encoding="utf-8"?>
 <p:properties xmlns:p="http://schemas.microsoft.com/office/2006/metadata/properties" xmlns:xsi="http://www.w3.org/2001/XMLSchema-instance" xmlns:pc="http://schemas.microsoft.com/office/infopath/2007/PartnerControls">
   <documentManagement>
     <Status xmlns="71af3243-3dd4-4a8d-8c0d-dd76da1f02a5">Not started</Status>
@@ -6726,15 +6936,11 @@
 </p:properties>
 </file>
 
-<file path=customXml/itemProps1.xml><?xml version="1.0" encoding="utf-8"?>
-<ds:datastoreItem xmlns:ds="http://schemas.openxmlformats.org/officeDocument/2006/customXml" ds:itemID="{05EF3759-52C9-494D-810E-B2DD79D25AE8}">
-  <ds:schemaRefs>
-    <ds:schemaRef ds:uri="http://schemas.microsoft.com/sharepoint/v3/contenttype/forms"/>
-  </ds:schemaRefs>
-</ds:datastoreItem>
+<file path=customXml/item4.xml><?xml version="1.0" encoding="utf-8"?>
+<b:Sources xmlns:b="http://schemas.openxmlformats.org/officeDocument/2006/bibliography" xmlns="http://schemas.openxmlformats.org/officeDocument/2006/bibliography" SelectedStyle="\APASixthEditionOfficeOnline.xsl" StyleName="APA" Version="6"/>
 </file>
 
-<file path=customXml/itemProps2.xml><?xml version="1.0" encoding="utf-8"?>
+<file path=customXml/itemProps1.xml><?xml version="1.0" encoding="utf-8"?>
 <ds:datastoreItem xmlns:ds="http://schemas.openxmlformats.org/officeDocument/2006/customXml" ds:itemID="{4308CA73-F9EA-41E6-BB4B-20FAACCD49DE}">
   <ds:schemaRefs>
     <ds:schemaRef ds:uri="http://schemas.microsoft.com/office/2006/metadata/contentType"/>
@@ -6753,15 +6959,15 @@
 </ds:datastoreItem>
 </file>
 
-<file path=customXml/itemProps3.xml><?xml version="1.0" encoding="utf-8"?>
-<ds:datastoreItem xmlns:ds="http://schemas.openxmlformats.org/officeDocument/2006/customXml" ds:itemID="{1E5966CC-2E01-4405-935A-8E039D9F578A}">
+<file path=customXml/itemProps2.xml><?xml version="1.0" encoding="utf-8"?>
+<ds:datastoreItem xmlns:ds="http://schemas.openxmlformats.org/officeDocument/2006/customXml" ds:itemID="{05EF3759-52C9-494D-810E-B2DD79D25AE8}">
   <ds:schemaRefs>
-    <ds:schemaRef ds:uri="http://schemas.openxmlformats.org/officeDocument/2006/bibliography"/>
+    <ds:schemaRef ds:uri="http://schemas.microsoft.com/sharepoint/v3/contenttype/forms"/>
   </ds:schemaRefs>
 </ds:datastoreItem>
 </file>
 
-<file path=customXml/itemProps4.xml><?xml version="1.0" encoding="utf-8"?>
+<file path=customXml/itemProps3.xml><?xml version="1.0" encoding="utf-8"?>
 <ds:datastoreItem xmlns:ds="http://schemas.openxmlformats.org/officeDocument/2006/customXml" ds:itemID="{E57A970D-2C6E-4A2B-99A4-9AD6320AEE66}">
   <ds:schemaRefs>
     <ds:schemaRef ds:uri="http://schemas.microsoft.com/office/2006/metadata/properties"/>
@@ -6769,4 +6975,12 @@
     <ds:schemaRef ds:uri="71af3243-3dd4-4a8d-8c0d-dd76da1f02a5"/>
   </ds:schemaRefs>
 </ds:datastoreItem>
+</file>
+
+<file path=customXml/itemProps4.xml><?xml version="1.0" encoding="utf-8"?>
+<ds:datastoreItem xmlns:ds="http://schemas.openxmlformats.org/officeDocument/2006/customXml" ds:itemID="{1E5966CC-2E01-4405-935A-8E039D9F578A}">
+  <ds:schemaRefs>
+    <ds:schemaRef ds:uri="http://schemas.openxmlformats.org/officeDocument/2006/bibliography"/>
+  </ds:schemaRefs>
+</ds:datastoreItem>
 </file>
</xml_diff>